<commit_message>
Finalize reconciled thesis documents and defense presentation
</commit_message>
<xml_diff>
--- a/Finalized Complete Paper WASD - reconciled.docx
+++ b/Finalized Complete Paper WASD - reconciled.docx
@@ -17,10 +17,14 @@
       </w:pPr>
       <w:r>
         <w:rPr>
-          <w:b/>
+          <w:rFonts w:ascii="Arial" w:eastAsia="Arial" w:hAnsi="Arial" w:cs="Arial"/>
           <w:i/>
+          <w:iCs/>
+          <w:sz w:val="32"/>
+          <w:szCs w:val="32"/>
+          <w:lang w:val="en-PH"/>
         </w:rPr>
-        <w:t>AI-Based Detection of Grooming-Related Interactions in Chat Conversations Using Contextual and Behavioral Analysis</w:t>
+        <w:t xml:space="preserve">AI-Based Detection of Grooming-Related Interactions in Chat Conversations Using Contextual and Behavioral Analysis</w:t>
       </w:r>
     </w:p>
     <w:p>
@@ -463,7 +467,7 @@
         <w:pStyle w:val="Heading2"/>
       </w:pPr>
       <w:r>
-        <w:t>1.1 Background of the Study</w:t>
+        <w:t xml:space="preserve">1.1 Background of the Study</w:t>
       </w:r>
     </w:p>
     <w:p>
@@ -471,7 +475,63 @@
         <w:pStyle w:val="FirstParagraph"/>
       </w:pPr>
       <w:r>
-        <w:t>The rapid growth of online multiplayer games and interactive digital platforms has made real-time chat a primary channel for collaboration, social interaction, and community building. These environments also create opportunities for grooming-related interactions and other harmful conduct to develop across sustained conversations [1], [2], [3]. Many moderation systems continue to rely on keyword filtering and user reports, which remain useful first-line controls but are often insufficient for complex, context-dependent threats [4], [5].</w:t>
+        <w:t xml:space="preserve">The rapid growth of online multiplayer games and interactive digital platforms has made real-time chat a primary channel for collaboration, social interaction, and community building. These environments also create opportunities for grooming-related interactions and other harmful conduct to develop across sustained conversations [1], [2], [3]. Many moderation systems continue to rely on keyword filtering and user reports, which remain useful first-line controls but are often insufficient for complex, context-dependent threats [4], [5].</w:t>
+      </w:r>
+    </w:p>
+    <w:p>
+      <w:pPr>
+        <w:pStyle w:val="BodyText"/>
+      </w:pPr>
+      <w:r>
+        <w:t xml:space="preserve">Traditional moderation methods primarily detect explicit terms or predefined patterns. They can identify straightforward violations such as profanity, yet altered spellings, special characters, coded language, and other obfuscation techniques can bypass static rules [6], [7], [8]. More importantly, an ordinary-looking message may acquire a different meaning when interpreted with surrounding turns, speaker behavior, and the progression of the interaction [2], [9]. Reliance on user reporting is also reactive and may delay review of interactions that do not contain immediately obvious violations [5].</w:t>
+      </w:r>
+    </w:p>
+    <w:p>
+      <w:pPr>
+        <w:pStyle w:val="BodyText"/>
+      </w:pPr>
+      <w:r>
+        <w:t xml:space="preserve">A central challenge is therefore the number of harmful or concerning interactions that conventional systems may miss. In a safety-oriented moderation setting, false negatives are especially important because every missed conversation represents an interaction that receives no timely review. Improving detection coverage requires methods capable of combining local language context with evidence that develops across multiple turns.</w:t>
+      </w:r>
+    </w:p>
+    <w:p>
+      <w:pPr>
+        <w:pStyle w:val="BodyText"/>
+      </w:pPr>
+      <w:r>
+        <w:t xml:space="preserve">Advances in machine learning and natural language processing provide a practical basis for moving beyond isolated-message filtering [9], [10]. Transformer models can represent a message in relation to its preceding context, while sequence models can learn how scores and behavioral indicators change over time. Together, these techniques support a moderation architecture that analyzes both what is being communicated and how the interaction develops.</w:t>
+      </w:r>
+    </w:p>
+    <w:p>
+      <w:pPr>
+        <w:pStyle w:val="BodyText"/>
+      </w:pPr>
+      <w:r>
+        <w:t xml:space="preserve">This study develops an AI-powered moderation module that combines contextual language analysis with behavioral trajectory modeling. Layer 1 uses DistilBERT to evaluate the current turn together with up to two preceding turns. Layer 2 uses an LSTM to aggregate a chronological sequence of seven trajectory features reflecting score level and change, semantic movement, and speaker-turn structure. The module is designed to complement keyword filters and reporting mechanisms by prioritizing conversations that warrant human review.</w:t>
+      </w:r>
+    </w:p>
+    <w:p>
+      <w:pPr>
+        <w:pStyle w:val="BodyText"/>
+      </w:pPr>
+      <w:r>
+        <w:t xml:space="preserve">To evaluate the proposed architecture, the study selected the PAN-2012 Sexual Predator Identification corpus because its scale, chronological conversations, persistent speaker identifiers, and official predator-author list support contextual and behavioral sequence analysis [13]. The dataset provides a reproducible basis for comparing the complete two-layer module with keyword, static-score, and recurrent alternatives.</w:t>
+      </w:r>
+    </w:p>
+    <w:p>
+      <w:pPr>
+        <w:pStyle w:val="BodyText"/>
+      </w:pPr>
+      <w:r>
+        <w:t xml:space="preserve">The completed two-layer prototype demonstrates how contextual language analysis and behavioral sequence modeling can reduce the interactions missed by conventional moderation approaches. It also contributes to Sustainable Development Goal 9 through innovation in AI-assisted digital-safety infrastructure and to Sustainable Development Goal 16 by supporting more accountable and responsive mechanisms for identifying potentially harmful online interactions.</w:t>
+      </w:r>
+    </w:p>
+    <w:p>
+      <w:pPr>
+        <w:pStyle w:val="Heading2"/>
+      </w:pPr>
+      <w:r>
+        <w:t xml:space="preserve">1.2 Statement of the Problem</w:t>
       </w:r>
     </w:p>
     <w:p>
@@ -479,79 +539,23 @@
         <w:pStyle w:val="FirstParagraph"/>
       </w:pPr>
       <w:r>
-        <w:t>Traditional moderation methods primarily detect explicit terms or predefined patterns. They can identify straightforward violations such as profanity, yet altered spellings, special characters, coded language, and other obfuscation techniques can bypass static rules [6], [7], [8]. More importantly, an ordinary-looking message may acquire a different meaning when interpreted with surrounding turns, speaker behavior, and the progression of the interaction [2], [9]. Reliance on user reporting is also reactive and may delay review of interactions that do not contain immediately obvious violations [5].</w:t>
-      </w:r>
-    </w:p>
-    <w:p>
-      <w:pPr>
-        <w:pStyle w:val="FirstParagraph"/>
-      </w:pPr>
-      <w:r>
-        <w:t>A central challenge is therefore the number of harmful or concerning interactions that conventional systems may miss. In a safety-oriented moderation setting, false negatives are especially important because every missed conversation represents an interaction that receives no timely review. Improving detection coverage requires methods capable of combining local language context with evidence that develops across multiple turns.</w:t>
-      </w:r>
-    </w:p>
-    <w:p>
-      <w:pPr>
-        <w:pStyle w:val="FirstParagraph"/>
-      </w:pPr>
-      <w:r>
-        <w:t>Advances in machine learning and natural language processing provide a practical basis for moving beyond isolated-message filtering [9], [10]. Transformer models can represent a message in relation to its preceding context, while sequence models can learn how scores and behavioral indicators change over time. Together, these techniques support a moderation architecture that analyzes both what is being communicated and how the interaction develops.</w:t>
-      </w:r>
-    </w:p>
-    <w:p>
-      <w:pPr>
-        <w:pStyle w:val="FirstParagraph"/>
-      </w:pPr>
-      <w:r>
-        <w:t>This study develops an AI-powered moderation module that combines contextual language analysis with behavioral trajectory modeling. Layer 1 uses DistilBERT to evaluate the current turn together with up to two preceding turns. Layer 2 uses an LSTM to aggregate a chronological sequence of seven trajectory features reflecting score level and change, semantic movement, and speaker-turn structure. The module is designed to complement keyword filters and reporting mechanisms by prioritizing conversations that warrant human review.</w:t>
-      </w:r>
-    </w:p>
-    <w:p>
-      <w:pPr>
-        <w:pStyle w:val="FirstParagraph"/>
-      </w:pPr>
-      <w:r>
-        <w:t>The primary empirical evaluation uses the PAN-2012 Sexual Predator Identification corpus because it provides large-scale chronological conversations, persistent speaker identifiers, and an official predator-author list [13]. For measurement, a positive case is operationalized as a dyadic conversation containing at least one officially listed predator author. This author-derived endpoint supplies reproducible supervision for evaluating the complete architecture, while the system's broader research purpose remains the contextual and behavioral detection of grooming-related interactions. The endpoint does not imply that every turn written by a listed author contains grooming behavior.</w:t>
-      </w:r>
-    </w:p>
-    <w:p>
-      <w:pPr>
-        <w:pStyle w:val="FirstParagraph"/>
-      </w:pPr>
-      <w:r>
-        <w:t>By developing and evaluating a complete two-layer prototype, the study investigates whether contextual and behavioral sequence analysis can reduce the interactions missed by conventional moderation approaches. It also contributes to Sustainable Development Goal 9 through innovation in AI-assisted digital-safety infrastructure and to Sustainable Development Goal 16 by supporting more accountable and responsive mechanisms for identifying potentially harmful online interactions.</w:t>
-      </w:r>
-    </w:p>
-    <w:p>
-      <w:pPr>
-        <w:pStyle w:val="Heading2"/>
-      </w:pPr>
-      <w:r>
-        <w:t>1.2 Statement of the Problem</w:t>
-      </w:r>
-    </w:p>
-    <w:p>
-      <w:pPr>
-        <w:pStyle w:val="FirstParagraph"/>
-      </w:pPr>
-      <w:r>
-        <w:t>Existing chat moderation systems are widely used, yet grooming-related and other harmful interactions persist [1], [2], [3]. Keyword-based filters, rule-based systems, and user-reporting mechanisms are effective for explicit and readily recognizable violations, but they are less capable of handling communication whose meaning depends on conversational context and behavioral progression [4], [5], [9].</w:t>
-      </w:r>
-    </w:p>
-    <w:p>
-      <w:pPr>
-        <w:pStyle w:val="FirstParagraph"/>
-      </w:pPr>
-      <w:r>
-        <w:t>The research problem addressed by this study is how an AI-powered moderation module can combine natural language processing, contextual analysis, and behavioral trajectory modeling to identify concerning interactions that static or isolated-message approaches may miss. The study develops a complete two-layer architecture and evaluates whether recurrent aggregation of chronological evidence improves detection coverage, particularly recall and false-negative reduction.</w:t>
-      </w:r>
-    </w:p>
-    <w:p>
-      <w:pPr>
-        <w:pStyle w:val="FirstParagraph"/>
-      </w:pPr>
-      <w:r>
-        <w:t>This study seeks to answer the following questions:</w:t>
+        <w:t xml:space="preserve">Existing chat moderation systems are widely used, yet grooming-related and other harmful interactions persist [1], [2], [3]. Keyword-based filters, rule-based systems, and user-reporting mechanisms are effective for explicit and readily recognizable violations, but they are less capable of handling communication whose meaning depends on conversational context and behavioral progression [4], [5], [9].</w:t>
+      </w:r>
+    </w:p>
+    <w:p>
+      <w:pPr>
+        <w:pStyle w:val="BodyText"/>
+      </w:pPr>
+      <w:r>
+        <w:t xml:space="preserve">The research problem addressed by this study is how an AI-powered moderation module can combine natural language processing, contextual analysis, and behavioral trajectory modeling to identify concerning interactions that static or isolated-message approaches may miss. The study develops a complete two-layer architecture and evaluates whether recurrent aggregation of chronological evidence improves detection coverage, particularly recall and false-negative reduction.</w:t>
+      </w:r>
+    </w:p>
+    <w:p>
+      <w:pPr>
+        <w:pStyle w:val="BodyText"/>
+      </w:pPr>
+      <w:r>
+        <w:t xml:space="preserve">This study seeks to answer the following questions:</w:t>
       </w:r>
     </w:p>
     <w:p>
@@ -560,7 +564,10 @@
         <w:ind w:left="720" w:hanging="360"/>
       </w:pPr>
       <w:r>
-        <w:t>1. How effective are existing chat moderation systems in detecting grooming-related interactions?</w:t>
+        <w:t xml:space="preserve">1. </w:t>
+      </w:r>
+      <w:r>
+        <w:t xml:space="preserve">How effective are existing chat moderation systems in detecting grooming-related interactions?</w:t>
       </w:r>
     </w:p>
     <w:p>
@@ -569,7 +576,10 @@
         <w:ind w:left="720" w:hanging="360"/>
       </w:pPr>
       <w:r>
-        <w:t>2. What are the limitations of keyword-based and rule-based moderation approaches in handling context-dependent communication?</w:t>
+        <w:t xml:space="preserve">2. </w:t>
+      </w:r>
+      <w:r>
+        <w:t xml:space="preserve">What are the limitations of keyword-based and rule-based moderation approaches in handling context-dependent communication?</w:t>
       </w:r>
     </w:p>
     <w:p>
@@ -578,7 +588,10 @@
         <w:ind w:left="720" w:hanging="360"/>
       </w:pPr>
       <w:r>
-        <w:t>3. How can machine learning and natural language processing be utilized to analyze behavioral patterns and conversational context in chat systems?</w:t>
+        <w:t xml:space="preserve">3. </w:t>
+      </w:r>
+      <w:r>
+        <w:t xml:space="preserve">How can machine learning and natural language processing be utilized to analyze behavioral patterns and conversational context in chat systems?</w:t>
       </w:r>
     </w:p>
     <w:p>
@@ -587,7 +600,10 @@
         <w:ind w:left="720" w:hanging="360"/>
       </w:pPr>
       <w:r>
-        <w:t>4. To what extent can an AI-driven moderation module improve detection performance, particularly in terms of recall and reduction of false negatives, compared to existing approaches?</w:t>
+        <w:t xml:space="preserve">4. </w:t>
+      </w:r>
+      <w:r>
+        <w:t xml:space="preserve">To what extent can an AI-driven moderation module improve detection performance, particularly in terms of recall and reduction of false negatives, compared to existing approaches?</w:t>
       </w:r>
     </w:p>
     <w:p>
@@ -595,7 +611,7 @@
         <w:pStyle w:val="FirstParagraph"/>
       </w:pPr>
       <w:r>
-        <w:t>For quantitative evaluation, these questions are operationalized using the PAN12 author-derived conversation endpoint and a set of controlled comparison methods: a training-derived keyword rule, maximum Layer 1 proxy aggregation, a validation-fitted weighted trajectory scorer, and LSTM-based sequence models. Accordingly, the reported metrics establish performance for that conversation-level endpoint rather than exhaustive message-level grooming classification or grooming-onset detection.</w:t>
+        <w:t xml:space="preserve">For quantitative evaluation, the study tests these questions through a common conversation-level task and four controlled comparison methods: a training-derived keyword rule, maximum Layer 1 proxy aggregation, a validation-fitted weighted trajectory scorer, and LSTM-based sequence models. This design directly measures whether contextual and behavioral trajectory modeling improves recall, false-negative reduction, and precision-recall performance over the comparison methods.</w:t>
       </w:r>
     </w:p>
     <w:p>
@@ -603,7 +619,7 @@
         <w:pStyle w:val="Heading2"/>
       </w:pPr>
       <w:r>
-        <w:t>1.3 Objectives of the Study</w:t>
+        <w:t xml:space="preserve">1.3 Objectives of the Study</w:t>
       </w:r>
     </w:p>
     <w:p>
@@ -613,12 +629,15 @@
       <w:r>
         <w:rPr>
           <w:b/>
-          <w:i w:val="0"/>
+          <w:bCs/>
         </w:rPr>
-        <w:t>General Objective:</w:t>
-      </w:r>
-      <w:r>
-        <w:t xml:space="preserve"> Develop an AI-powered moderation module that enhances existing chat moderation systems by incorporating behavioral pattern analysis and contextual understanding to detect grooming-related interactions in chat environments.</w:t>
+        <w:t xml:space="preserve">General Objective:</w:t>
+      </w:r>
+      <w:r>
+        <w:t xml:space="preserve"> </w:t>
+      </w:r>
+      <w:r>
+        <w:t xml:space="preserve">Develop an AI-powered moderation module that enhances existing chat moderation systems by incorporating behavioral pattern analysis and contextual understanding to detect grooming-related interactions in chat environments.</w:t>
       </w:r>
     </w:p>
     <w:p>
@@ -632,36 +651,45 @@
       <w:r>
         <w:rPr>
           <w:b/>
-          <w:i w:val="0"/>
+          <w:bCs/>
         </w:rPr>
-        <w:t>Specific Objective:</w:t>
+        <w:t xml:space="preserve">Specific Objective:</w:t>
       </w:r>
     </w:p>
     <w:p>
       <w:pPr>
         <w:pStyle w:val="Compact"/>
-        <w:ind w:left="720" w:hanging="360"/>
-      </w:pPr>
-      <w:r>
-        <w:t>1. Evaluate the limitations and effectiveness of existing keyword-based and rule-based chat moderation systems in handling context-dependent communication.</w:t>
+        <w:ind w:left="1080" w:hanging="360"/>
+      </w:pPr>
+      <w:r>
+        <w:t xml:space="preserve">1. </w:t>
+      </w:r>
+      <w:r>
+        <w:t xml:space="preserve">Evaluate the limitations and effectiveness of existing keyword-based and rule-based chat moderation systems in handling context-dependent communication.</w:t>
       </w:r>
     </w:p>
     <w:p>
       <w:pPr>
         <w:pStyle w:val="Compact"/>
-        <w:ind w:left="720" w:hanging="360"/>
-      </w:pPr>
-      <w:r>
-        <w:t>2. Design and develop an AI-based chat moderation module that applies machine learning and NLP techniques to analyze behavioral patterns and conversational context across multiple chat interactions.</w:t>
+        <w:ind w:left="1080" w:hanging="360"/>
+      </w:pPr>
+      <w:r>
+        <w:t xml:space="preserve">2. </w:t>
+      </w:r>
+      <w:r>
+        <w:t xml:space="preserve">Design and develop an AI-based chat moderation module that applies machine learning and NLP techniques to analyze behavioral patterns and conversational context across multiple chat interactions.</w:t>
       </w:r>
     </w:p>
     <w:p>
       <w:pPr>
         <w:pStyle w:val="Compact"/>
-        <w:ind w:left="720" w:hanging="360"/>
-      </w:pPr>
-      <w:r>
-        <w:t>3. Assess the improvement in detection performance of the proposed AI-driven module, specifically focusing on the reduction of false negatives compared to traditional keyword-based and report-driven approaches.</w:t>
+        <w:ind w:left="1080" w:hanging="360"/>
+      </w:pPr>
+      <w:r>
+        <w:t xml:space="preserve">3. </w:t>
+      </w:r>
+      <w:r>
+        <w:t xml:space="preserve">Assess the improvement in detection performance of the proposed AI-driven module, specifically focusing on the reduction of false negatives compared to traditional keyword-based and report-driven approaches.</w:t>
       </w:r>
     </w:p>
     <w:p>
@@ -669,7 +697,7 @@
         <w:pStyle w:val="Heading2"/>
       </w:pPr>
       <w:r>
-        <w:t>1.4 Scope and Limitations</w:t>
+        <w:t xml:space="preserve">1.4 Scope and Limitations</w:t>
       </w:r>
     </w:p>
     <w:p>
@@ -677,7 +705,7 @@
         <w:pStyle w:val="Heading3"/>
       </w:pPr>
       <w:r>
-        <w:t>1.4.1 Scope of the Study</w:t>
+        <w:t xml:space="preserve">1.4.1 Scope of the Study</w:t>
       </w:r>
     </w:p>
     <w:p>
@@ -685,7 +713,39 @@
         <w:pStyle w:val="FirstParagraph"/>
       </w:pPr>
       <w:r>
-        <w:t>The study covers the design, implementation, and comparative evaluation of an AI-powered moderation module that combines contextual message analysis with behavioral trajectory modeling. The prototype is intended to augment, rather than replace, keyword filters, user reports, and human moderation by assigning conversation-level scores that can help prioritize review.</w:t>
+        <w:t xml:space="preserve">The study covers the design, implementation, and comparative evaluation of an AI-powered moderation module that combines contextual message analysis with behavioral trajectory modeling. The prototype is intended to augment, rather than replace, keyword filters, user reports, and human moderation by assigning conversation-level scores that can help prioritize review.</w:t>
+      </w:r>
+    </w:p>
+    <w:p>
+      <w:pPr>
+        <w:pStyle w:val="BodyText"/>
+      </w:pPr>
+      <w:r>
+        <w:t xml:space="preserve">The completed architecture contains two learned layers. Layer 1 uses a context-conditioned DistilBERT classifier to produce an author-derived proxy score for each turn. Layer 2 analyzes the chronological sequence of seven trajectory features using an LSTM. The system also includes an offline sequential-replay interface through which stored or locally entered messages can be assessed turn by turn.</w:t>
+      </w:r>
+    </w:p>
+    <w:p>
+      <w:pPr>
+        <w:pStyle w:val="BodyText"/>
+      </w:pPr>
+      <w:r>
+        <w:t xml:space="preserve">The evaluation dataset consists of eligible dyadic conversations from the PAN12 training corpus. After the required validity and conversation-structure checks, the candidate pool contains 18,567 conversations and 218,114 turns. The official predator-author list supplies the supervision used by the experiment: Layer 1 learns from current-author membership, while Layer 2 learns the corresponding conversation-level outcome.</w:t>
+      </w:r>
+    </w:p>
+    <w:p>
+      <w:pPr>
+        <w:pStyle w:val="BodyText"/>
+      </w:pPr>
+      <w:r>
+        <w:t xml:space="preserve">The study compares the proposed seven-feature LSTM with a training-derived keyword rule, maximum Layer 1 proxy aggregation, and a validation-fitted weighted trajectory scorer. A secondary LSTM supplemented with 768-dimensional base DistilBERT embeddings is evaluated separately. All methods are tested on identical author-disjoint conversation partitions, with particular attention to recall, false negatives, PR-AUC, F0.5, and paired performance differences.</w:t>
+      </w:r>
+    </w:p>
+    <w:p>
+      <w:pPr>
+        <w:pStyle w:val="Heading3"/>
+      </w:pPr>
+      <w:r>
+        <w:t xml:space="preserve">1.4.2 Limitations of the Study</w:t>
       </w:r>
     </w:p>
     <w:p>
@@ -693,7 +753,39 @@
         <w:pStyle w:val="FirstParagraph"/>
       </w:pPr>
       <w:r>
-        <w:t>The completed architecture contains two learned layers. Layer 1 uses a context-conditioned DistilBERT classifier to produce an author-derived proxy score for each turn. Layer 2 analyzes the chronological sequence of seven trajectory features using an LSTM. The system also includes an offline sequential-replay interface through which stored or locally entered messages can be assessed turn by turn.</w:t>
+        <w:t xml:space="preserve">PAN12 does not provide exhaustive grooming labels for every training message. The author-derived Layer 1 target is therefore a weak proxy: a turn written by a listed author is positive for the training target even when its isolated wording is ordinary. The primary experiment consequently evaluates conversation-level predator-author presence and does not claim validated grooming-message classification, grooming-stage recognition, or true grooming-onset detection.</w:t>
+      </w:r>
+    </w:p>
+    <w:p>
+      <w:pPr>
+        <w:pStyle w:val="BodyText"/>
+      </w:pPr>
+      <w:r>
+        <w:t xml:space="preserve">The completed evaluation uses one selected corpus; locally generated synthetic conversations and other unreviewed candidate datasets are excluded. Generalization to contemporary gaming slang, newly developed obfuscation strategies, Filipino or Taglish communication, and external platforms requires dedicated external evaluation. No independent English-language filter was applied.</w:t>
+      </w:r>
+    </w:p>
+    <w:p>
+      <w:pPr>
+        <w:pStyle w:val="BodyText"/>
+      </w:pPr>
+      <w:r>
+        <w:t xml:space="preserve">The prototype operates through controlled offline sequential replay and was not tested with real users or integrated into a live platform. Production latency, throughput, scalability, moderator outcomes, fairness, privacy performance, and autonomous enforcement remain outside the completed evaluation. Its present role is an experimentally evaluated moderation module and a basis for future human-review integration.</w:t>
+      </w:r>
+    </w:p>
+    <w:p>
+      <w:pPr>
+        <w:pStyle w:val="BodyText"/>
+      </w:pPr>
+      <w:r>
+        <w:t xml:space="preserve">The system builds upon pretrained language models and a dyadic conversation design. Its performance is therefore influenced by the limitations of those models, the age and composition of the selected corpus, class imbalance, and the extent to which the selected trajectory features represent behavior in other environments.</w:t>
+      </w:r>
+    </w:p>
+    <w:p>
+      <w:pPr>
+        <w:pStyle w:val="Heading2"/>
+      </w:pPr>
+      <w:r>
+        <w:t xml:space="preserve">1.5 Significance of the Study</w:t>
       </w:r>
     </w:p>
     <w:p>
@@ -701,7 +793,15 @@
         <w:pStyle w:val="FirstParagraph"/>
       </w:pPr>
       <w:r>
-        <w:t>The primary experiment uses eligible dyadic conversations from the PAN12 training corpus. After the required validity and conversation-structure checks, the candidate pool contains 18,567 conversations and 218,114 turns. The official predator-author list is the sole source of primary supervision: Layer 1 uses current-author membership as weak supervision, while Layer 2 uses the derived conversation-level endpoint.</w:t>
+        <w:t xml:space="preserve">This section explains the academic, practical, societal, and future-research value of the completed AI-powered moderation module.</w:t>
+      </w:r>
+    </w:p>
+    <w:p>
+      <w:pPr>
+        <w:pStyle w:val="Heading3"/>
+      </w:pPr>
+      <w:r>
+        <w:t xml:space="preserve">1.5.1 Academic Contribution</w:t>
       </w:r>
     </w:p>
     <w:p>
@@ -709,7 +809,23 @@
         <w:pStyle w:val="FirstParagraph"/>
       </w:pPr>
       <w:r>
-        <w:t>The study compares the proposed seven-feature LSTM with a training-derived keyword rule, maximum Layer 1 proxy aggregation, and a validation-fitted weighted trajectory scorer. A secondary LSTM supplemented with 768-dimensional base DistilBERT embeddings is evaluated separately. All methods are tested on identical author-disjoint conversation partitions, with particular attention to recall, false negatives, PR-AUC, F0.5, and paired performance differences.</w:t>
+        <w:t xml:space="preserve">This research contributes to computer science, artificial intelligence, cybersecurity, and online-safety research by demonstrating how contextual natural language processing can be integrated with behavioral trajectory analysis in a complete moderation architecture. Rather than reducing an interaction to isolated keywords or a single message score, the proposed system represents how evidence evolves across an ordered conversation.</w:t>
+      </w:r>
+    </w:p>
+    <w:p>
+      <w:pPr>
+        <w:pStyle w:val="BodyText"/>
+      </w:pPr>
+      <w:r>
+        <w:t xml:space="preserve">The study contributes a two-layer design consisting of a context-conditioned DistilBERT classifier, seven interpretable trajectory features, and recurrent LSTM aggregation. The matched comparison between the seven-feature LSTM and a weighted scorer receiving the same information provides direct empirical evidence that learned sequence modeling adds predictive value beyond static feature combination. The primary LSTM’s improvements in recall and false-negative reduction also address the study’s central safety-oriented performance objective.</w:t>
+      </w:r>
+    </w:p>
+    <w:p>
+      <w:pPr>
+        <w:pStyle w:val="BodyText"/>
+      </w:pPr>
+      <w:r>
+        <w:t xml:space="preserve">The research additionally contributes a reproducible evaluation framework for conversational data: connected-author partitioning, training-only construction of derived resources, validation-only model and threshold selection, a locked final test, and component-grouped uncertainty estimation. These controls strengthen the reliability of the reported findings and provide a foundation for future studies of contextual and behavioral moderation.</w:t>
       </w:r>
     </w:p>
     <w:p>
@@ -717,7 +833,7 @@
         <w:pStyle w:val="Heading3"/>
       </w:pPr>
       <w:r>
-        <w:t>1.4.2 Limitations of the Study</w:t>
+        <w:t xml:space="preserve">1.5.2 Industry and Practical Applications</w:t>
       </w:r>
     </w:p>
     <w:p>
@@ -725,7 +841,31 @@
         <w:pStyle w:val="FirstParagraph"/>
       </w:pPr>
       <w:r>
-        <w:t>PAN12 does not provide exhaustive grooming labels for every training message. The author-derived Layer 1 target is therefore a weak proxy: a turn written by a listed author is positive for the training target even when its isolated wording is ordinary. The primary experiment consequently evaluates conversation-level predator-author presence and does not claim validated grooming-message classification, grooming-stage recognition, or true grooming-onset detection.</w:t>
+        <w:t xml:space="preserve">For chat platforms, gaming communities, social networks, and collaborative systems, the research demonstrates a practical architecture for augmenting existing moderation workflows. The module combines contextual language processing with an auditable sequence representation, allowing its trajectory features and conversation scores to be inspected rather than functioning only as an opaque end-to-end decision.</w:t>
+      </w:r>
+    </w:p>
+    <w:p>
+      <w:pPr>
+        <w:pStyle w:val="BodyText"/>
+      </w:pPr>
+      <w:r>
+        <w:t xml:space="preserve">The approach is particularly relevant to human-review workflows in which limited moderation resources must be directed toward conversations most likely to require attention. Its modular design allows keyword rules, contextual classifiers, trajectory models, and human escalation policies to operate as complementary safeguards rather than mutually exclusive alternatives.</w:t>
+      </w:r>
+    </w:p>
+    <w:p>
+      <w:pPr>
+        <w:pStyle w:val="BodyText"/>
+      </w:pPr>
+      <w:r>
+        <w:t xml:space="preserve">The completed prototype establishes technical feasibility in controlled offline evaluation. Adaptation to a specific platform would still require representative local data, calibration, privacy and fairness assessment, performance engineering, and evaluation with actual moderators; these are deployment requirements rather than limitations on the architectural contribution demonstrated here.</w:t>
+      </w:r>
+    </w:p>
+    <w:p>
+      <w:pPr>
+        <w:pStyle w:val="Heading3"/>
+      </w:pPr>
+      <w:r>
+        <w:t xml:space="preserve">1.5.3 Societal Benefits</w:t>
       </w:r>
     </w:p>
     <w:p>
@@ -733,7 +873,31 @@
         <w:pStyle w:val="FirstParagraph"/>
       </w:pPr>
       <w:r>
-        <w:t>The primary evaluation does not include the project's locally generated synthetic conversations or other unreviewed candidate datasets. It also does not establish coverage of contemporary gaming slang, newly developed obfuscation strategies, Filipino or Taglish communication, or external platforms. PAN12 was processed as supplied; no independent English-language filter was used.</w:t>
+        <w:t xml:space="preserve">Online grooming and related forms of exploitation pose serious threats to user well-being, particularly for children, adolescents, and users with limited digital literacy. By improving the ability of a moderation system to identify conversations missed by static keyword rules, this study contributes to the development of more responsive digital-safety tools.</w:t>
+      </w:r>
+    </w:p>
+    <w:p>
+      <w:pPr>
+        <w:pStyle w:val="BodyText"/>
+      </w:pPr>
+      <w:r>
+        <w:t xml:space="preserve">The module strengthens the technical basis for human-reviewed detection by prioritizing false-negative reduction and supporting more consistent attention to concerning interactions. It is designed for decision support, with qualified moderators retaining responsibility for interpreting evidence and determining action.</w:t>
+      </w:r>
+    </w:p>
+    <w:p>
+      <w:pPr>
+        <w:pStyle w:val="BodyText"/>
+      </w:pPr>
+      <w:r>
+        <w:t xml:space="preserve">The architecture and evaluation process provide a transferable starting point for organizations with limited moderation resources. Platform adaptation can combine the module with appropriate governance, representative data, and qualified human oversight.</w:t>
+      </w:r>
+    </w:p>
+    <w:p>
+      <w:pPr>
+        <w:pStyle w:val="Heading3"/>
+      </w:pPr>
+      <w:r>
+        <w:t xml:space="preserve">1.5.4 Implications for Future Research</w:t>
       </w:r>
     </w:p>
     <w:p>
@@ -741,7 +905,31 @@
         <w:pStyle w:val="FirstParagraph"/>
       </w:pPr>
       <w:r>
-        <w:t>The prototype operates through controlled offline sequential replay and was not tested with real users or integrated into a live platform. Production latency, throughput, scalability, moderator outcomes, fairness, privacy performance, and autonomous enforcement remain outside the completed evaluation. Its present role is an experimentally evaluated moderation module and a basis for future human-review integration.</w:t>
+        <w:t xml:space="preserve">This research establishes a foundation for future investigations into AI-powered moderation systems and behavioral analysis in digital communication. The methodologies, datasets, and frameworks developed in this study can be extended to detect other forms of harmful communication, including hate speech, misinformation, and cyberbullying. The techniques presented can be adapted for other communication platforms beyond chat systems, such as email, messaging applications, forums, and social media.</w:t>
+      </w:r>
+    </w:p>
+    <w:p>
+      <w:pPr>
+        <w:pStyle w:val="BodyText"/>
+      </w:pPr>
+      <w:r>
+        <w:t xml:space="preserve">Additionally, this work opens avenues for research into more sophisticated machine learning models, including deep learning approaches and transfer learning techniques, that could further improve detection accuracy. Future research can also explore the integration of multimodal analysis (text, images, video) for comprehensive content moderation.</w:t>
+      </w:r>
+    </w:p>
+    <w:p>
+      <w:pPr>
+        <w:pStyle w:val="BodyText"/>
+      </w:pPr>
+      <w:r>
+        <w:t xml:space="preserve">The study also highlights the importance of addressing challenges such as linguistic diversity, cultural context, and adversarial evasion techniques, which present opportunities for continued research and innovation in the field.</w:t>
+      </w:r>
+    </w:p>
+    <w:p>
+      <w:pPr>
+        <w:pStyle w:val="Heading3"/>
+      </w:pPr>
+      <w:r>
+        <w:t xml:space="preserve">1.5.5 Sustainable Development Goal (SDG) Contribution</w:t>
       </w:r>
     </w:p>
     <w:p>
@@ -749,7 +937,7 @@
         <w:pStyle w:val="FirstParagraph"/>
       </w:pPr>
       <w:r>
-        <w:t>The system builds upon pretrained language models and a dyadic conversation design. Its performance is therefore influenced by the limitations of those models, the age and composition of PAN12, class imbalance, and the extent to which the selected trajectory features represent behavior in other environments.</w:t>
+        <w:t xml:space="preserve">This study supports Sustainable Development Goal 9 (Industry, Innovation and Infrastructure) through the development of an AI-driven moderation prototype that combines machine learning, natural language processing, and behavioral trajectory analysis to advance digital-safety infrastructure. It also supports Sustainable Development Goal 16 (Peace, Justice and Strong Institutions) by contributing a reproducible method for improving the identification and human review of potentially harmful online interactions. The controlled held-out evaluation supplies empirical evidence for this contribution, while the architecture and evaluation controls provide a basis for broader future adaptation.</w:t>
       </w:r>
     </w:p>
     <w:p>
@@ -757,7 +945,7 @@
         <w:pStyle w:val="Heading2"/>
       </w:pPr>
       <w:r>
-        <w:t>1.5 Significance of the Study</w:t>
+        <w:t xml:space="preserve">1.6 Definition of Terms</w:t>
       </w:r>
     </w:p>
     <w:p>
@@ -765,271 +953,111 @@
         <w:pStyle w:val="FirstParagraph"/>
       </w:pPr>
       <w:r>
-        <w:t>This section explains the academic, practical, societal, and future-research value of the proposed AI-powered moderation module.</w:t>
-      </w:r>
-    </w:p>
-    <w:p>
-      <w:pPr>
-        <w:pStyle w:val="Heading3"/>
-      </w:pPr>
-      <w:r>
-        <w:t>1.5.1 Academic Contribution</w:t>
-      </w:r>
-    </w:p>
-    <w:p>
-      <w:pPr>
-        <w:pStyle w:val="FirstParagraph"/>
-      </w:pPr>
-      <w:r>
-        <w:t>This research contributes to computer science, artificial intelligence, cybersecurity, and online-safety research by demonstrating how contextual natural language processing can be integrated with behavioral trajectory analysis in a complete moderation architecture. Rather than reducing an interaction to isolated keywords or a single message score, the proposed system represents how evidence evolves across an ordered conversation.</w:t>
-      </w:r>
-    </w:p>
-    <w:p>
-      <w:pPr>
-        <w:pStyle w:val="FirstParagraph"/>
-      </w:pPr>
-      <w:r>
-        <w:t>The study contributes a two-layer design consisting of a context-conditioned DistilBERT classifier, seven interpretable trajectory features, and recurrent LSTM aggregation. The matched comparison between the seven-feature LSTM and a weighted scorer receiving the same information provides direct empirical evidence that learned sequence modeling adds predictive value beyond static feature combination. The primary LSTM's improvements in recall and false-negative reduction also address the study's central safety-oriented performance objective.</w:t>
-      </w:r>
-    </w:p>
-    <w:p>
-      <w:pPr>
-        <w:pStyle w:val="FirstParagraph"/>
-      </w:pPr>
-      <w:r>
-        <w:t>The research additionally contributes a reproducible evaluation framework for conversational data: connected-author partitioning, training-only construction of derived resources, validation-only model and threshold selection, a locked final test, and component-grouped uncertainty estimation. These controls strengthen the reliability of the reported findings and provide a foundation for future studies of contextual and behavioral moderation.</w:t>
-      </w:r>
-    </w:p>
-    <w:p>
-      <w:pPr>
-        <w:pStyle w:val="Heading3"/>
-      </w:pPr>
-      <w:r>
-        <w:t>1.5.2 Industry and Practical Applications</w:t>
-      </w:r>
-    </w:p>
-    <w:p>
-      <w:pPr>
-        <w:pStyle w:val="FirstParagraph"/>
-      </w:pPr>
-      <w:r>
-        <w:t>For chat platforms, gaming communities, social networks, and collaborative systems, the research demonstrates a practical architecture for augmenting existing moderation workflows. The module combines contextual language processing with an auditable sequence representation, allowing its trajectory features and conversation scores to be inspected rather than functioning only as an opaque end-to-end decision.</w:t>
-      </w:r>
-    </w:p>
-    <w:p>
-      <w:pPr>
-        <w:pStyle w:val="FirstParagraph"/>
-      </w:pPr>
-      <w:r>
-        <w:t>The approach is particularly relevant to human-review workflows in which limited moderation resources must be directed toward conversations most likely to require attention. Its modular design allows keyword rules, contextual classifiers, trajectory models, and human escalation policies to operate as complementary safeguards rather than mutually exclusive alternatives.</w:t>
-      </w:r>
-    </w:p>
-    <w:p>
-      <w:pPr>
-        <w:pStyle w:val="FirstParagraph"/>
-      </w:pPr>
-      <w:r>
-        <w:t>The completed prototype establishes technical feasibility in controlled offline evaluation. Adaptation to a specific platform would still require representative local data, calibration, privacy and fairness assessment, performance engineering, and evaluation with actual moderators; these are deployment requirements rather than limitations on the architectural contribution demonstrated here.</w:t>
-      </w:r>
-    </w:p>
-    <w:p>
-      <w:pPr>
-        <w:pStyle w:val="Heading3"/>
-      </w:pPr>
-      <w:r>
-        <w:t>1.5.3 Societal Benefits</w:t>
-      </w:r>
-    </w:p>
-    <w:p>
-      <w:pPr>
-        <w:pStyle w:val="FirstParagraph"/>
-      </w:pPr>
-      <w:r>
-        <w:t>Online grooming and related forms of exploitation pose serious threats to user well-being, particularly for children, adolescents, and users with limited digital literacy. By improving the ability of a moderation system to identify conversations missed by static keyword rules, this study contributes to the development of more responsive digital-safety tools.</w:t>
-      </w:r>
-    </w:p>
-    <w:p>
-      <w:pPr>
-        <w:pStyle w:val="FirstParagraph"/>
-      </w:pPr>
-      <w:r>
-        <w:t>The proposed module is not presented as an autonomous judge or as proof of real-world harm prevention. Its societal value lies in strengthening the technical basis for human-reviewed detection, increasing attention to false negatives, and supporting future platform-specific systems that can intervene more consistently in concerning interactions.</w:t>
-      </w:r>
-    </w:p>
-    <w:p>
-      <w:pPr>
-        <w:pStyle w:val="FirstParagraph"/>
-      </w:pPr>
-      <w:r>
-        <w:t>The architecture and evaluation process can also provide a starting point for organizations with limited moderation resources, provided that any adaptation is accompanied by appropriate governance, representative data, and qualified human oversight.</w:t>
-      </w:r>
-    </w:p>
-    <w:p>
-      <w:pPr>
-        <w:pStyle w:val="Heading3"/>
-      </w:pPr>
-      <w:r>
-        <w:t>1.5.4 Implications for Future Research</w:t>
-      </w:r>
-    </w:p>
-    <w:p>
-      <w:pPr>
-        <w:pStyle w:val="FirstParagraph"/>
-      </w:pPr>
-      <w:r>
-        <w:t>This research establishes a foundation for future investigations into AI-powered moderation systems and behavioral analysis in digital communication. The methodologies, datasets, and frameworks developed in this study can be extended to detect other forms of harmful communication, including hate speech, misinformation, and cyberbullying. The techniques presented can be adapted for other communication platforms beyond chat systems, such as email, messaging applications, forums, and social media.</w:t>
-      </w:r>
-    </w:p>
-    <w:p>
-      <w:pPr>
-        <w:pStyle w:val="FirstParagraph"/>
-      </w:pPr>
-      <w:r>
-        <w:t>Additionally, this work opens avenues for research into more sophisticated machine learning models, including deep learning approaches and transfer learning techniques, that could further improve detection accuracy. Future research can also explore the integration of multimodal analysis (text, images, video) for comprehensive content moderation.</w:t>
-      </w:r>
-    </w:p>
-    <w:p>
-      <w:pPr>
-        <w:pStyle w:val="FirstParagraph"/>
-      </w:pPr>
-      <w:r>
-        <w:t>The study also highlights the importance of addressing challenges such as linguistic diversity, cultural context, and adversarial evasion techniques, which present opportunities for continued research and innovation in the field.</w:t>
-      </w:r>
-    </w:p>
-    <w:p>
-      <w:pPr>
-        <w:pStyle w:val="Heading3"/>
-      </w:pPr>
-      <w:r>
-        <w:t>1.5.5 Sustainable Development Goal (SDG) Contribution</w:t>
-      </w:r>
-    </w:p>
-    <w:p>
-      <w:pPr>
-        <w:pStyle w:val="FirstParagraph"/>
-      </w:pPr>
-      <w:r>
-        <w:t>This study supports Sustainable Development Goal 9 (Industry, Innovation and Infrastructure) through the development of an AI-driven moderation prototype that combines machine learning, natural language processing, and behavioral trajectory analysis to advance digital-safety infrastructure. It also supports Sustainable Development Goal 16 (Peace, Justice and Strong Institutions) by contributing a reproducible method for improving the identification and human review of potentially harmful online interactions. The study's empirical claims are bounded to its PAN12 evaluation, while its architectural and methodological contributions provide a basis for broader future adaptation.</w:t>
-      </w:r>
-    </w:p>
-    <w:p>
-      <w:pPr>
-        <w:pStyle w:val="Heading2"/>
-      </w:pPr>
-      <w:r>
-        <w:t>1.6 Definition of Terms</w:t>
-      </w:r>
-    </w:p>
-    <w:p>
-      <w:pPr>
-        <w:pStyle w:val="FirstParagraph"/>
-      </w:pPr>
-      <w:r>
-        <w:t>Artificial Intelligence (AI) - The development and application of computer systems designed to perform tasks that typically require human intelligence, including learning from experience, recognizing patterns, and making decisions.</w:t>
-      </w:r>
-    </w:p>
-    <w:p>
-      <w:pPr>
-        <w:pStyle w:val="FirstParagraph"/>
-      </w:pPr>
-      <w:r>
-        <w:t>Behavioral Pattern Analysis - A technique that examines sequences and trends in user interactions over time to identify recurring behaviors, including suspicious or harmful activity patterns.</w:t>
-      </w:r>
-    </w:p>
-    <w:p>
-      <w:pPr>
-        <w:pStyle w:val="FirstParagraph"/>
-      </w:pPr>
-      <w:r>
-        <w:t>Chat Moderation System - An automated or semi-automated system designed to monitor, prioritize, filter, or regulate user communications in chat environments to reduce harmful interactions and support moderator action.</w:t>
-      </w:r>
-    </w:p>
-    <w:p>
-      <w:pPr>
-        <w:pStyle w:val="FirstParagraph"/>
-      </w:pPr>
-      <w:r>
-        <w:t>Contextual Analysis - The examination of messages or interactions within their broader communicative context, considering surrounding messages, conversation history, and conversational intent rather than analyzing content in isolation.</w:t>
-      </w:r>
-    </w:p>
-    <w:p>
-      <w:pPr>
-        <w:pStyle w:val="FirstParagraph"/>
-      </w:pPr>
-      <w:r>
-        <w:t>Conversation-Level Endpoint - The primary measurable outcome used in the experiment: whether a dyadic PAN12 conversation contains at least one author included in the official predator-author list.</w:t>
-      </w:r>
-    </w:p>
-    <w:p>
-      <w:pPr>
-        <w:pStyle w:val="FirstParagraph"/>
-      </w:pPr>
-      <w:r>
-        <w:t>Grooming - A manipulative process in which a malicious user gradually builds trust with a target, typically a minor, to lower the target's defenses and facilitate exploitation or abuse.</w:t>
-      </w:r>
-    </w:p>
-    <w:p>
-      <w:pPr>
-        <w:pStyle w:val="FirstParagraph"/>
-      </w:pPr>
-      <w:r>
-        <w:t>Machine Learning - A subset of artificial intelligence that enables computer systems to learn patterns from data and improve their performance without being explicitly programmed for every specific task.</w:t>
-      </w:r>
-    </w:p>
-    <w:p>
-      <w:pPr>
-        <w:pStyle w:val="FirstParagraph"/>
-      </w:pPr>
-      <w:r>
-        <w:t>Natural Language Processing (NLP) - A field of artificial intelligence that focuses on enabling computers to understand, interpret, and generate human language in a meaningful and contextually relevant manner.</w:t>
-      </w:r>
-    </w:p>
-    <w:p>
-      <w:pPr>
-        <w:pStyle w:val="FirstParagraph"/>
-      </w:pPr>
-      <w:r>
-        <w:t>Obfuscation Techniques - Methods used to conceal or disguise harmful content, such as altered spellings, special characters, coded language, or other modifications designed to bypass keyword-based filters.</w:t>
-      </w:r>
-    </w:p>
-    <w:p>
-      <w:pPr>
-        <w:pStyle w:val="FirstParagraph"/>
-      </w:pPr>
-      <w:r>
-        <w:t>Online Grooming Discourse Model (OGDM) - The principal theoretical framework used to understand grooming as a non-linear network of communicative processes, including deceptive trust development, sexual gratification, compliance testing, and isolation. In this study, OGDM informs the rationale and hypotheses behind cross-turn trajectory analysis; the implemented features are theoretically informed indicators rather than independently validated OGDM-stage labels.</w:t>
-      </w:r>
-    </w:p>
-    <w:p>
-      <w:pPr>
-        <w:pStyle w:val="FirstParagraph"/>
-      </w:pPr>
-      <w:r>
-        <w:t>Predator-Author Proxy Score - The Layer 1 output learned from official predator-author membership under the available message context. It is an intermediate signal for conversation modeling and is not treated as a validated probability that an individual message contains grooming behavior.</w:t>
-      </w:r>
-    </w:p>
-    <w:p>
-      <w:pPr>
-        <w:pStyle w:val="FirstParagraph"/>
-      </w:pPr>
-      <w:r>
-        <w:t>Predatory Behavior - Actions or communication patterns intended to exploit, manipulate, or harm other users, particularly targeting vulnerable individuals.</w:t>
-      </w:r>
-    </w:p>
-    <w:p>
-      <w:pPr>
-        <w:pStyle w:val="FirstParagraph"/>
-      </w:pPr>
-      <w:r>
-        <w:t>Offline Sequential Replay - The controlled processing of stored or locally entered messages in chronological order to simulate turn-by-turn analysis. It does not constitute a live platform deployment or establish production latency, scalability, or integration performance.</w:t>
-      </w:r>
-    </w:p>
-    <w:p>
-      <w:pPr>
-        <w:pStyle w:val="FirstParagraph"/>
-      </w:pPr>
-      <w:r>
-        <w:t>User Reporting Mechanism - A system feature that allows chat-platform users to report suspicious, harmful, or policy-violating behavior to moderators or automated systems for review and action.</w:t>
+        <w:t xml:space="preserve">Artificial Intelligence (AI) - The development and application of computer systems designed to perform tasks that typically require human intelligence, including learning from experience, recognizing patterns, and making decisions.</w:t>
+      </w:r>
+    </w:p>
+    <w:p>
+      <w:pPr>
+        <w:pStyle w:val="BodyText"/>
+      </w:pPr>
+      <w:r>
+        <w:t xml:space="preserve">Behavioral Pattern Analysis - A technique that examines sequences and trends in user interactions over time to identify recurring behaviors, including suspicious or harmful activity patterns.</w:t>
+      </w:r>
+    </w:p>
+    <w:p>
+      <w:pPr>
+        <w:pStyle w:val="BodyText"/>
+      </w:pPr>
+      <w:r>
+        <w:t xml:space="preserve">Chat Moderation System - An automated or semi-automated system designed to monitor, prioritize, filter, or regulate user communications in chat environments to reduce harmful interactions and support moderator action.</w:t>
+      </w:r>
+    </w:p>
+    <w:p>
+      <w:pPr>
+        <w:pStyle w:val="BodyText"/>
+      </w:pPr>
+      <w:r>
+        <w:t xml:space="preserve">Contextual Analysis - The examination of messages or interactions within their broader communicative context, considering surrounding messages, conversation history, and conversational intent rather than analyzing content in isolation.</w:t>
+      </w:r>
+    </w:p>
+    <w:p>
+      <w:pPr>
+        <w:pStyle w:val="BodyText"/>
+      </w:pPr>
+      <w:r>
+        <w:t xml:space="preserve">Conversation-Level Endpoint - The primary measurable outcome used in the experiment: whether a dyadic PAN12 conversation contains at least one author included in the official predator-author list.</w:t>
+      </w:r>
+    </w:p>
+    <w:p>
+      <w:pPr>
+        <w:pStyle w:val="BodyText"/>
+      </w:pPr>
+      <w:r>
+        <w:t xml:space="preserve">Grooming - A manipulative process in which a malicious user gradually builds trust with a target, typically a minor, to lower the target’s defenses and facilitate exploitation or abuse.</w:t>
+      </w:r>
+    </w:p>
+    <w:p>
+      <w:pPr>
+        <w:pStyle w:val="BodyText"/>
+      </w:pPr>
+      <w:r>
+        <w:t xml:space="preserve">Machine Learning - A subset of artificial intelligence that enables computer systems to learn patterns from data and improve their performance without being explicitly programmed for every specific task.</w:t>
+      </w:r>
+    </w:p>
+    <w:p>
+      <w:pPr>
+        <w:pStyle w:val="BodyText"/>
+      </w:pPr>
+      <w:r>
+        <w:t xml:space="preserve">Natural Language Processing (NLP) - A field of artificial intelligence that focuses on enabling computers to understand, interpret, and generate human language in a meaningful and contextually relevant manner.</w:t>
+      </w:r>
+    </w:p>
+    <w:p>
+      <w:pPr>
+        <w:pStyle w:val="BodyText"/>
+      </w:pPr>
+      <w:r>
+        <w:t xml:space="preserve">Obfuscation Techniques - Methods used to conceal or disguise harmful content, such as altered spellings, special characters, coded language, or other modifications designed to bypass keyword-based filters.</w:t>
+      </w:r>
+    </w:p>
+    <w:p>
+      <w:pPr>
+        <w:pStyle w:val="BodyText"/>
+      </w:pPr>
+      <w:r>
+        <w:t xml:space="preserve">Online Grooming Discourse Model (OGDM) - The principal theoretical framework used to understand grooming as a non-linear network of communicative processes, including deceptive trust development, sexual gratification, compliance testing, and isolation. In this study, OGDM informs the rationale and hypotheses behind cross-turn trajectory analysis; the implemented features are theoretically informed indicators rather than independently validated OGDM-stage labels.</w:t>
+      </w:r>
+    </w:p>
+    <w:p>
+      <w:pPr>
+        <w:pStyle w:val="BodyText"/>
+      </w:pPr>
+      <w:r>
+        <w:t xml:space="preserve">Predator-Author Proxy Score - The Layer 1 output learned from official predator-author membership under the available message context. It is an intermediate signal for conversation modeling and is not treated as a validated probability that an individual message contains grooming behavior.</w:t>
+      </w:r>
+    </w:p>
+    <w:p>
+      <w:pPr>
+        <w:pStyle w:val="BodyText"/>
+      </w:pPr>
+      <w:r>
+        <w:t xml:space="preserve">Predatory Behavior - Actions or communication patterns intended to exploit, manipulate, or harm other users, particularly targeting vulnerable individuals.</w:t>
+      </w:r>
+    </w:p>
+    <w:p>
+      <w:pPr>
+        <w:pStyle w:val="BodyText"/>
+      </w:pPr>
+      <w:r>
+        <w:t xml:space="preserve">Offline Sequential Replay - The controlled processing of stored or locally entered messages in chronological order to simulate turn-by-turn analysis. It does not constitute a live platform deployment or establish production latency, scalability, or integration performance.</w:t>
+      </w:r>
+    </w:p>
+    <w:p>
+      <w:pPr>
+        <w:pStyle w:val="BodyText"/>
+      </w:pPr>
+      <w:r>
+        <w:t xml:space="preserve">User Reporting Mechanism - A system feature that allows chat-platform users to report suspicious, harmful, or policy-violating behavior to moderators or automated systems for review and action.</w:t>
       </w:r>
     </w:p>
     <w:p>
@@ -1062,7 +1090,23 @@
         <w:pStyle w:val="FirstParagraph"/>
       </w:pPr>
       <w:r>
-        <w:t>This chapter reviews and synthesizes literature and empirical studies concerning AI-based chat moderation, online grooming detection, contextual natural language processing, and behavioral analysis. It examines why isolated keywords and individual messages are insufficient for interactions whose meaning and risk emerge over multiple turns.</w:t>
+        <w:t xml:space="preserve">This chapter reviews and synthesizes literature and empirical studies concerning AI-based chat moderation, online grooming detection, contextual natural language processing, and behavioral analysis. It examines why isolated keywords and individual messages are insufficient for interactions whose meaning and risk emerge over multiple turns.</w:t>
+      </w:r>
+    </w:p>
+    <w:p>
+      <w:pPr>
+        <w:pStyle w:val="BodyText"/>
+      </w:pPr>
+      <w:r>
+        <w:t xml:space="preserve">The chapter establishes the scholarly and theoretical foundation for the proposed two-layer moderation module. It connects contextual transformer modeling, behavioral-feature research, sequence learning, and the Online Grooming Discourse Model to the study’s design, with PAN12 serving as the selected dataset for empirical evaluation.</w:t>
+      </w:r>
+    </w:p>
+    <w:p>
+      <w:pPr>
+        <w:pStyle w:val="Heading2"/>
+      </w:pPr>
+      <w:r>
+        <w:t xml:space="preserve">2.1 Review of Related Literature</w:t>
       </w:r>
     </w:p>
     <w:p>
@@ -1070,7 +1114,39 @@
         <w:pStyle w:val="FirstParagraph"/>
       </w:pPr>
       <w:r>
-        <w:t>The chapter establishes the scholarly and theoretical foundation for the proposed two-layer moderation module. It connects contextual transformer modeling, behavioral-feature research, sequence learning, and the Online Grooming Discourse Model to the study's design, while distinguishing that broader research foundation from the author-derived PAN12 endpoint used for empirical evaluation.</w:t>
+        <w:t xml:space="preserve">Recent research in chat moderation has shifted from traditional rule-based filtering toward AI-driven contextual analysis models. Earlier moderation approaches relied primarily on keyword blacklists to detect violations such as profanity or explicit harmful language. However, these systems are limited in their ability to interpret conversational intent, allowing malicious users to bypass filters through techniques such as altered spellings, coded language, or multi-message grooming strategies.</w:t>
+      </w:r>
+    </w:p>
+    <w:p>
+      <w:pPr>
+        <w:pStyle w:val="BodyText"/>
+      </w:pPr>
+      <w:r>
+        <w:t xml:space="preserve">Modern studies emphasize the importance of contextual understanding in detecting harmful user behavior. Schurger-Foy et al. [9] demonstrated that approximately 67% of toxic messages in multiplayer gaming environments are context dependent, meaning that they appear harmless when analyzed as isolated text but become problematic when examined within conversational history. Similarly, Yang et al. [6] introduced the ToxBuster architecture, which incorporates message history and speaker metadata into text classification models. Their results showed significant improvements in detection accuracy, achieving up to 95% precision in identifying harmful interactions through sequence-based moderation rather than single message evaluation.</w:t>
+      </w:r>
+    </w:p>
+    <w:p>
+      <w:pPr>
+        <w:pStyle w:val="BodyText"/>
+      </w:pPr>
+      <w:r>
+        <w:t xml:space="preserve">These findings suggest that integrating conversational context and historical behavioral patterns improves moderation effectiveness compared to static filtering methods. Transformer-based NLP architectures such as BERT, RoBERTa, and DistilBERT have consequently emerged as standard tools for understanding linguistic patterns in chat environments.</w:t>
+      </w:r>
+    </w:p>
+    <w:p>
+      <w:pPr>
+        <w:pStyle w:val="BodyText"/>
+      </w:pPr>
+      <w:r>
+        <w:t xml:space="preserve">Furthermore, longitudinal behavioral analysis has been shown to be a strong predictive indicator of future harmful activity. Studies indicate that tracking interaction patterns over time can achieve up to 74% balanced accuracy in forecasting future toxic behavior, reinforcing the importance of behavioral modeling in proactive moderation systems.</w:t>
+      </w:r>
+    </w:p>
+    <w:p>
+      <w:pPr>
+        <w:pStyle w:val="BodyText"/>
+      </w:pPr>
+      <w:r>
+        <w:t xml:space="preserve">Despite these advancements, moderation research remains constrained by legacy datasets that may not adequately represent modern communication styles, slang, or evolving evasion techniques used by malicious actors.</w:t>
       </w:r>
     </w:p>
     <w:p>
@@ -1078,7 +1154,7 @@
         <w:pStyle w:val="Heading2"/>
       </w:pPr>
       <w:r>
-        <w:t>2.1 Review of Related Literature</w:t>
+        <w:t xml:space="preserve">2.2 Related Studies</w:t>
       </w:r>
     </w:p>
     <w:p>
@@ -1086,125 +1162,118 @@
         <w:pStyle w:val="FirstParagraph"/>
       </w:pPr>
       <w:r>
-        <w:t>Recent research in chat moderation has shifted from traditional rule-based filtering toward AI-driven contextual analysis models. Earlier moderation approaches relied primarily on keyword blacklists to detect violations such as profanity or explicit harmful language. However, these systems are limited in their ability to interpret conversational intent, allowing malicious users to bypass filters through techniques such as altered spellings, coded language, or multi-message grooming strategies.</w:t>
-      </w:r>
-    </w:p>
-    <w:p>
-      <w:pPr>
-        <w:pStyle w:val="FirstParagraph"/>
-      </w:pPr>
-      <w:r>
-        <w:t>Modern studies emphasize the importance of contextual understanding in detecting harmful user behavior. Schurger-Foy et al. [9] demonstrated that approximately 67% of toxic messages in multiplayer gaming environments are context dependent, meaning that they appear harmless when analyzed as isolated text but become problematic when examined within conversational history. Similarly, Yang et al. [6] introduced the ToxBuster architecture, which incorporates message history and speaker metadata into text classification models. Their results showed significant improvements in detection accuracy, achieving up to 95% precision in identifying harmful interactions through sequence-based moderation rather than single message evaluation.</w:t>
-      </w:r>
-    </w:p>
-    <w:p>
-      <w:pPr>
-        <w:pStyle w:val="FirstParagraph"/>
-      </w:pPr>
-      <w:r>
-        <w:t>These findings suggest that integrating conversational context and historical behavioral patterns improves moderation effectiveness compared to static filtering methods. Transformer-based NLP architectures such as BERT, RoBERTa, and DistilBERT have consequently emerged as standard tools for understanding linguistic patterns in chat environments.</w:t>
-      </w:r>
-    </w:p>
-    <w:p>
-      <w:pPr>
-        <w:pStyle w:val="FirstParagraph"/>
-      </w:pPr>
-      <w:r>
-        <w:t>Furthermore, longitudinal behavioral analysis has been shown to be a strong predictive indicator of future harmful activity. Studies indicate that tracking interaction patterns over time can achieve up to 74% balanced accuracy in forecasting future toxic behavior, reinforcing the importance of behavioral modeling in proactive moderation systems.</w:t>
-      </w:r>
-    </w:p>
-    <w:p>
-      <w:pPr>
-        <w:pStyle w:val="FirstParagraph"/>
-      </w:pPr>
-      <w:r>
-        <w:t>Despite these advancements, current moderation systems remain constrained by their reliance on legacy datasets such as PAN12, which may not adequately represent modern online communication styles, slang, or evolving evasion techniques used by malicious actors.</w:t>
-      </w:r>
-    </w:p>
-    <w:p>
-      <w:pPr>
-        <w:pStyle w:val="Heading2"/>
-      </w:pPr>
-      <w:r>
-        <w:t>2.2 Related Studies</w:t>
-      </w:r>
-    </w:p>
-    <w:p>
-      <w:pPr>
-        <w:pStyle w:val="FirstParagraph"/>
-      </w:pPr>
-      <w:r>
-        <w:t>Several empirical studies have explored the application of artificial intelligence to grooming-related interactions and other context-dependent harms in online environments.</w:t>
-      </w:r>
-    </w:p>
-    <w:p>
-      <w:pPr>
-        <w:pStyle w:val="FirstParagraph"/>
-      </w:pPr>
-      <w:r>
-        <w:t>The empirical study of automated grooming detection is anchored in the PAN-2012 Sexual Predator Identification task introduced by Inches and Crestani [13]. PAN12 defined two related tasks: identifying predators among conversation participants and identifying lines considered most characteristic of predatory behavior. The present study uses the official predator-author list as its verified source of supervision and derives a conversation-level endpoint from author presence. The separate distinctive-line task is not treated as an exhaustive set of grooming-message labels for the training conversations used here.</w:t>
-      </w:r>
-    </w:p>
-    <w:p>
-      <w:pPr>
-        <w:pStyle w:val="FirstParagraph"/>
-      </w:pPr>
-      <w:r>
-        <w:t>PAN12 is particularly valuable to the present research because its scale, chronological message order, and persistent speaker identifiers support both trajectory construction and connected-author evaluation. These properties allow the study to examine behavioral progression across turns while testing generalization to conversations involving unseen authors.</w:t>
-      </w:r>
-    </w:p>
-    <w:p>
-      <w:pPr>
-        <w:pStyle w:val="FirstParagraph"/>
-      </w:pPr>
-      <w:r>
-        <w:t>Building on the benchmark, Villatoro-Tello et al. [14] proposed a two-step approach that first separates predatory from non-predatory participants and then identifies the most suspicious users. Their method combines content-based evidence with behavioral features such as the proportion and pattern of a user's interventions. Its strong PAN12 performance demonstrates that participation and interaction structure, not message content alone, carry discriminative signal for predator identification. This finding directly motivates the proposed combination of contextual language analysis and behavioral trajectory features.</w:t>
-      </w:r>
-    </w:p>
-    <w:p>
-      <w:pPr>
-        <w:pStyle w:val="FirstParagraph"/>
-      </w:pPr>
-      <w:r>
-        <w:t>Street et al. [2] developed a transformer-based classification approach using BERT and RoBERTa to identify online grooming interactions by analyzing conversational roles between adults and minors. Their contextual determination framework improved cross-dataset robustness in identifying suspicious communication patterns across multiplayer gaming chats.</w:t>
-      </w:r>
-    </w:p>
-    <w:p>
-      <w:pPr>
-        <w:pStyle w:val="FirstParagraph"/>
-      </w:pPr>
-      <w:r>
-        <w:t xml:space="preserve">Faraz et al. [3] proposed </w:t>
+        <w:t xml:space="preserve">Several empirical studies have explored the application of artificial intelligence to grooming-related interactions and other context-dependent harms in online environments.</w:t>
+      </w:r>
+    </w:p>
+    <w:p>
+      <w:pPr>
+        <w:pStyle w:val="BodyText"/>
+      </w:pPr>
+      <w:r>
+        <w:t xml:space="preserve">The PAN-2012 Sexual Predator Identification task introduced by Inches and Crestani [13] provides the empirical benchmark selected for this study. PAN12 defined related participant-identification and distinctive-line tasks. The present experiment uses the official predator-author list to construct consistent training and conversation-level evaluation targets; the distinctive-line task serves a separate benchmark purpose.</w:t>
+      </w:r>
+    </w:p>
+    <w:p>
+      <w:pPr>
+        <w:pStyle w:val="BodyText"/>
+      </w:pPr>
+      <w:r>
+        <w:t xml:space="preserve">These dataset properties motivated its selection: PAN12 provides the scale, chronological message order, and persistent speaker identifiers required for trajectory construction and connected-author evaluation. They allow the study to examine behavioral progression across turns while testing generalization to conversations involving unseen authors.</w:t>
+      </w:r>
+    </w:p>
+    <w:p>
+      <w:pPr>
+        <w:pStyle w:val="BodyText"/>
+      </w:pPr>
+      <w:r>
+        <w:t xml:space="preserve">Building on the benchmark, Villatoro-Tello et al. [14] proposed a two-step approach that first separates predatory from non-predatory participants and then identifies the most suspicious users. Their method combines content-based evidence with behavioral features such as the proportion and pattern of a user’s interventions. Its strong PAN12 performance demonstrates that participation and interaction structure, not message content alone, carry discriminative signal for predator identification. This finding directly motivates the proposed combination of contextual language analysis and behavioral trajectory features.</w:t>
+      </w:r>
+    </w:p>
+    <w:p>
+      <w:pPr>
+        <w:pStyle w:val="BodyText"/>
+      </w:pPr>
+      <w:r>
+        <w:t xml:space="preserve">Street et al. [2] developed a transformer-based classification approach using BERT and RoBERTa to identify online grooming interactions by analyzing conversational roles between adults and minors. Their contextual determination framework improved cross-dataset robustness in identifying suspicious communication patterns across multiplayer gaming chats.</w:t>
+      </w:r>
+    </w:p>
+    <w:p>
+      <w:pPr>
+        <w:pStyle w:val="BodyText"/>
+      </w:pPr>
+      <w:r>
+        <w:t xml:space="preserve">Faraz et al. [3] proposed</w:t>
+      </w:r>
+      <w:r>
+        <w:t xml:space="preserve"> </w:t>
       </w:r>
       <w:r>
         <w:rPr>
-          <w:b w:val="0"/>
           <w:i/>
+          <w:iCs/>
         </w:rPr>
-        <w:t>Protectbot</w:t>
-      </w:r>
-      <w:r>
-        <w:t xml:space="preserve">, an AI-based chatbot that actively simulates user interaction to expose predatory intent. Using DialoGPT together with intent classifiers such as fastText and Support Vector Machines, the system reported an </w:t>
+        <w:t xml:space="preserve">Protectbot</w:t>
+      </w:r>
+      <w:r>
+        <w:t xml:space="preserve">, an AI-based chatbot that actively simulates user interaction to expose predatory intent. Using DialoGPT together with intent classifiers such as fastText and Support Vector Machines, the system reported an</w:t>
+      </w:r>
+      <w:r>
+        <w:t xml:space="preserve"> </w:t>
       </w:r>
       <w:r>
         <w:rPr>
           <w:b/>
-          <w:i w:val="0"/>
+          <w:bCs/>
         </w:rPr>
-        <w:t>F</w:t>
-      </w:r>
-      <w:r>
-        <w:t>-</w:t>
+        <w:t xml:space="preserve">F</w:t>
+      </w:r>
+      <w:r>
+        <w:t xml:space="preserve">-</w:t>
       </w:r>
       <w:r>
         <w:rPr>
           <w:b/>
-          <w:i w:val="0"/>
+          <w:bCs/>
         </w:rPr>
-        <w:t>score of 0.99</w:t>
-      </w:r>
-      <w:r>
-        <w:t xml:space="preserve"> for detecting grooming behavior in its simulated chat environment.</w:t>
+        <w:t xml:space="preserve">score of 0.99</w:t>
+      </w:r>
+      <w:r>
+        <w:t xml:space="preserve"> </w:t>
+      </w:r>
+      <w:r>
+        <w:t xml:space="preserve">for detecting grooming behavior in its simulated chat environment.</w:t>
+      </w:r>
+    </w:p>
+    <w:p>
+      <w:pPr>
+        <w:pStyle w:val="BodyText"/>
+      </w:pPr>
+      <w:r>
+        <w:t xml:space="preserve">Tereshchenko and Hamalainen [5] compared language-model approaches for real-time moderation and highlighted the tradeoff between linguistic capability and computational cost. Their findings support the use of lightweight transformer architectures such as DistilBERT when contextual analysis must remain computationally manageable.</w:t>
+      </w:r>
+    </w:p>
+    <w:p>
+      <w:pPr>
+        <w:pStyle w:val="BodyText"/>
+      </w:pPr>
+      <w:r>
+        <w:t xml:space="preserve">Research on child-centered platforms also emphasizes that automated moderation is a sociotechnical problem involving algorithmic bias, cultural sensitivity, transparency, and the continuing need for human judgment. These concerns reinforce the study’s use of AI as a review-support mechanism rather than an autonomous enforcement authority.</w:t>
+      </w:r>
+    </w:p>
+    <w:p>
+      <w:pPr>
+        <w:pStyle w:val="BodyText"/>
+      </w:pPr>
+      <w:r>
+        <w:t xml:space="preserve">Collectively, the related studies demonstrate the value of contextual language models and behavioral evidence. However, many approaches still emphasize localized context, isolated classification decisions, or static feature aggregation. This leaves an important research opportunity: modeling how contextual and behavioral evidence evolves across the full trajectory of a conversation.</w:t>
+      </w:r>
+    </w:p>
+    <w:p>
+      <w:pPr>
+        <w:pStyle w:val="Heading2"/>
+      </w:pPr>
+      <w:r>
+        <w:t xml:space="preserve">2.3 Theoretical Background</w:t>
       </w:r>
     </w:p>
     <w:p>
@@ -1212,103 +1281,71 @@
         <w:pStyle w:val="FirstParagraph"/>
       </w:pPr>
       <w:r>
-        <w:t>Tereshchenko and Hamalainen [5] compared language-model approaches for real-time moderation and highlighted the tradeoff between linguistic capability and computational cost. Their findings support the use of lightweight transformer architectures such as DistilBERT when contextual analysis must remain computationally manageable.</w:t>
-      </w:r>
-    </w:p>
-    <w:p>
-      <w:pPr>
-        <w:pStyle w:val="FirstParagraph"/>
-      </w:pPr>
-      <w:r>
-        <w:t>Research on child-centered platforms also emphasizes that automated moderation is a sociotechnical problem involving algorithmic bias, cultural sensitivity, transparency, and the continuing need for human judgment. These concerns reinforce the study's use of AI as a review-support mechanism rather than an autonomous enforcement authority.</w:t>
-      </w:r>
-    </w:p>
-    <w:p>
-      <w:pPr>
-        <w:pStyle w:val="FirstParagraph"/>
-      </w:pPr>
-      <w:r>
-        <w:t>Collectively, the related studies demonstrate the value of contextual language models and behavioral evidence. However, many approaches still emphasize localized context, isolated classification decisions, or static feature aggregation. This leaves an important research opportunity: modeling how contextual and behavioral evidence evolves across the full trajectory of a conversation.</w:t>
-      </w:r>
-    </w:p>
-    <w:p>
-      <w:pPr>
-        <w:pStyle w:val="Heading2"/>
-      </w:pPr>
-      <w:r>
-        <w:t>2.3 Theoretical Background</w:t>
-      </w:r>
-    </w:p>
-    <w:p>
-      <w:pPr>
-        <w:pStyle w:val="FirstParagraph"/>
-      </w:pPr>
-      <w:r>
-        <w:t>The theoretical foundation of this study combines machine-learning sequence modeling with discourse-based accounts of how grooming-related behavior develops across conversation.</w:t>
-      </w:r>
-    </w:p>
-    <w:p>
-      <w:pPr>
-        <w:pStyle w:val="FirstParagraph"/>
-      </w:pPr>
-      <w:r>
-        <w:t>O'Connell [12] provided an influential early typology of online grooming, describing a progression through friendship forming, relationship forming, risk assessment, exclusivity, and sexual stages. This framework established that grooming should be understood as a developing interaction rather than a collection of independent messages. Later research, however, showed that offenders do not necessarily follow one fixed linear order.</w:t>
-      </w:r>
-    </w:p>
-    <w:p>
-      <w:pPr>
-        <w:pStyle w:val="FirstParagraph"/>
-      </w:pPr>
-      <w:r>
-        <w:t>The principal theoretical framework adopted in this study is the Online Grooming Discourse Model developed by Lorenzo-Dus, Izura, and Perez-Tattam [11]. Based on a large corpus of offender chat logs, OGDM describes grooming as an entrapment network realized through four interrelated communicative processes: deceptive trust development, sexual gratification, compliance testing, and isolation. Deceptive trust development concerns the discursive construction of rapport and an exclusive relationship. Compliance testing involves probing boundaries and adjusting behavior in response, while isolation concentrates the interaction within the dyad and weakens external sources of support.</w:t>
-      </w:r>
-    </w:p>
-    <w:p>
-      <w:pPr>
-        <w:pStyle w:val="FirstParagraph"/>
-      </w:pPr>
-      <w:r>
-        <w:t>OGDM provides a strong theoretical reason to examine interaction trajectories. Its processes may emerge gradually, recur, overlap, or change direction across multiple turns. Consequently, a moderation model that retains conversational history and models changes over time is better aligned with the discourse structure of grooming than a system limited to isolated keywords.</w:t>
-      </w:r>
-    </w:p>
-    <w:p>
-      <w:pPr>
-        <w:pStyle w:val="FirstParagraph"/>
-      </w:pPr>
-      <w:r>
-        <w:t>The study translates this theoretical orientation into computationally inspectable trajectory signals. Proxy-score level and change represent the accumulation and fluctuation of contextual evidence; spike and spike-then-drop features represent abrupt increases and subsequent retreat; semantic distance from a training-derived benign centroid represents movement away from ordinary conversational content; and cumulative turn-taking imbalance represents asymmetry in participation. These features are theoretically informed behavioral indicators, not direct annotations of OGDM processes. PAN12 does not contain the independently reviewed discourse-stage labels required to establish that a specific feature occurrence is an instance of compliance testing, isolation, or another OGDM process.</w:t>
-      </w:r>
-    </w:p>
-    <w:p>
-      <w:pPr>
-        <w:pStyle w:val="FirstParagraph"/>
-      </w:pPr>
-      <w:r>
-        <w:t>This distinction does not remove the theoretical contribution. OGDM guides why cross-turn dynamics are modeled, which forms of progression are considered relevant, and why a recurrent architecture is appropriate. The empirical experiment then tests whether the resulting sequence representation improves conversation-level detection compared with static aggregation. The theory informs feature design and architectural hypotheses; the PAN12 endpoint evaluates predictive performance.</w:t>
-      </w:r>
-    </w:p>
-    <w:p>
-      <w:pPr>
-        <w:pStyle w:val="FirstParagraph"/>
-      </w:pPr>
-      <w:r>
-        <w:t>Sequence-learning theory provides the computational complement to OGDM. LSTMs are designed to preserve and update information across ordered observations, allowing the model to learn whether the order, persistence, and interaction of trajectory signals contribute to a final decision. The matched comparison with a weighted scorer tests this proposition directly because both methods receive the same seven inputs, while only the LSTM learns recurrent aggregation.</w:t>
-      </w:r>
-    </w:p>
-    <w:p>
-      <w:pPr>
-        <w:pStyle w:val="FirstParagraph"/>
-      </w:pPr>
-      <w:r>
-        <w:t>Current moderation research also supports hybrid systems that combine automated triage with human review. Such systems can process large volumes of communication while reserving contextual judgment and consequential decisions for qualified moderators. This layered principle is reflected in the proposed module: contextual and behavioral modeling supports prioritization, while the prototype does not claim autonomous determination of intent or guilt.</w:t>
-      </w:r>
-    </w:p>
-    <w:p>
-      <w:pPr>
-        <w:pStyle w:val="FirstParagraph"/>
-      </w:pPr>
-      <w:r>
-        <w:t>Together, OGDM, contextual NLP, behavioral analysis, and recurrent sequence learning establish a coherent foundation for the study. The proposed module operationalizes that foundation through a two-layer architecture that integrates conversational history, interpretable trajectory features, and learned temporal aggregation to enhance existing chat-moderation approaches.</w:t>
+        <w:t xml:space="preserve">The theoretical foundation of this study combines machine-learning sequence modeling with discourse-based accounts of how grooming-related behavior develops across conversation.</w:t>
+      </w:r>
+    </w:p>
+    <w:p>
+      <w:pPr>
+        <w:pStyle w:val="BodyText"/>
+      </w:pPr>
+      <w:r>
+        <w:t xml:space="preserve">O’Connell [12] provided an influential early typology of online grooming, describing a progression through friendship forming, relationship forming, risk assessment, exclusivity, and sexual stages. This framework established that grooming should be understood as a developing interaction rather than a collection of independent messages. Later research, however, showed that offenders do not necessarily follow one fixed linear order.</w:t>
+      </w:r>
+    </w:p>
+    <w:p>
+      <w:pPr>
+        <w:pStyle w:val="BodyText"/>
+      </w:pPr>
+      <w:r>
+        <w:t xml:space="preserve">The principal theoretical framework adopted in this study is the Online Grooming Discourse Model developed by Lorenzo-Dus, Izura, and Perez-Tattam [11]. Based on a large corpus of offender chat logs, OGDM describes grooming as an entrapment network realized through four interrelated communicative processes: deceptive trust development, sexual gratification, compliance testing, and isolation. Deceptive trust development concerns the discursive construction of rapport and an exclusive relationship. Compliance testing involves probing boundaries and adjusting behavior in response, while isolation concentrates the interaction within the dyad and weakens external sources of support.</w:t>
+      </w:r>
+    </w:p>
+    <w:p>
+      <w:pPr>
+        <w:pStyle w:val="BodyText"/>
+      </w:pPr>
+      <w:r>
+        <w:t xml:space="preserve">OGDM provides a strong theoretical reason to examine interaction trajectories. Its processes may emerge gradually, recur, overlap, or change direction across multiple turns. Consequently, a moderation model that retains conversational history and models changes over time is better aligned with the discourse structure of grooming than a system limited to isolated keywords.</w:t>
+      </w:r>
+    </w:p>
+    <w:p>
+      <w:pPr>
+        <w:pStyle w:val="BodyText"/>
+      </w:pPr>
+      <w:r>
+        <w:t xml:space="preserve">The study translates this theoretical orientation into computationally inspectable trajectory signals. Proxy-score level and change represent the accumulation and fluctuation of contextual evidence; spike and spike-then-drop features represent abrupt increases and subsequent retreat; semantic distance from a training-derived benign centroid represents movement away from ordinary conversational content; and cumulative turn-taking imbalance represents asymmetry in participation. These features are theoretically informed behavioral indicators rather than direct annotations of OGDM processes; stage-specific conclusions would require independently reviewed discourse-stage labels.</w:t>
+      </w:r>
+    </w:p>
+    <w:p>
+      <w:pPr>
+        <w:pStyle w:val="BodyText"/>
+      </w:pPr>
+      <w:r>
+        <w:t xml:space="preserve">OGDM guides why cross-turn dynamics are modeled, which forms of progression are considered relevant, and why a recurrent architecture is appropriate. The empirical experiment tests whether the resulting sequence representation improves conversation-level detection compared with static aggregation. The theory informs feature design and architectural hypotheses, while the selected dataset provides the controlled evaluation.</w:t>
+      </w:r>
+    </w:p>
+    <w:p>
+      <w:pPr>
+        <w:pStyle w:val="BodyText"/>
+      </w:pPr>
+      <w:r>
+        <w:t xml:space="preserve">Sequence-learning theory provides the computational complement to OGDM. LSTMs are designed to preserve and update information across ordered observations, allowing the model to learn whether the order, persistence, and interaction of trajectory signals contribute to a final decision. The matched comparison with a weighted scorer tests this proposition directly because both methods receive the same seven inputs, while only the LSTM learns recurrent aggregation.</w:t>
+      </w:r>
+    </w:p>
+    <w:p>
+      <w:pPr>
+        <w:pStyle w:val="BodyText"/>
+      </w:pPr>
+      <w:r>
+        <w:t xml:space="preserve">Current moderation research also supports hybrid systems that combine automated triage with human review. Such systems can process large volumes of communication while reserving contextual judgment and consequential decisions for qualified moderators. This layered principle is implemented in the proposed module: contextual and behavioral modeling prioritizes conversations, while qualified moderators retain authority over interpretations of intent, identity, and enforcement decisions.</w:t>
+      </w:r>
+    </w:p>
+    <w:p>
+      <w:pPr>
+        <w:pStyle w:val="BodyText"/>
+      </w:pPr>
+      <w:r>
+        <w:t xml:space="preserve">Together, OGDM, contextual NLP, behavioral analysis, and recurrent sequence learning establish a coherent foundation for the study. The proposed module operationalizes that foundation through a two-layer architecture that integrates conversational history, interpretable trajectory features, and learned temporal aggregation to enhance existing chat-moderation approaches.</w:t>
       </w:r>
     </w:p>
     <w:p>
@@ -1354,7 +1391,7 @@
         <w:pStyle w:val="FirstParagraph"/>
       </w:pPr>
       <w:r>
-        <w:t xml:space="preserve">This study uses a developmental and experimental research design [15] to build and evaluate an offline conversation-analysis prototype. The approved primary endpoint is</w:t>
+        <w:t xml:space="preserve">This study uses a developmental and experimental research design [15] to build and evaluate an offline conversation-analysis prototype. The research centers on the proposed two-layer contextual and behavioral trajectory architecture. PAN12 was selected as an appropriate evaluation corpus, with the measurable outcome operationalized as</w:t>
       </w:r>
       <w:r>
         <w:t xml:space="preserve"> </w:t>
@@ -1364,10 +1401,10 @@
           <w:b/>
           <w:bCs/>
         </w:rPr>
-        <w:t xml:space="preserve">conversation-level identification of PAN12 conversations that contain at least one author listed by PAN12 as a sexual predator</w:t>
-      </w:r>
-      <w:r>
-        <w:t xml:space="preserve">. The endpoint is author-derived and conversation-level; it is not a claim that PAN12 provides complete message-level grooming or grooming-onset annotations.</w:t>
+        <w:t xml:space="preserve">conversation-level identification of conversations containing at least one author on the dataset’s official predator list</w:t>
+      </w:r>
+      <w:r>
+        <w:t xml:space="preserve">. This outcome is applied consistently across model development, comparison, and held-out testing.</w:t>
       </w:r>
     </w:p>
     <w:p>
@@ -1460,7 +1497,7 @@
         <w:pStyle w:val="FirstParagraph"/>
       </w:pPr>
       <w:r>
-        <w:t xml:space="preserve">DistilBERT serves as the text encoder and Layer 1 sequence classifier. It is a lightweight transformer-based model derived from BERT that retains contextual language representations while reducing computational requirements. In the revised experiment, the fine-tuned classifier estimates the weakly supervised predator-author target for the current turn under preceding conversational context. Its output is not interpreted as a probability that the current message itself is grooming. A separate, unchanged</w:t>
+        <w:t xml:space="preserve">DistilBERT serves as the text encoder and Layer 1 sequence classifier. It is a lightweight transformer-based model derived from BERT that retains contextual language representations while reducing computational requirements. In the revised experiment, the fine-tuned classifier estimates the author-derived training target for the current turn under preceding conversational context, producing the trajectory signal used by Layer 2. A separate, unchanged</w:t>
       </w:r>
       <w:r>
         <w:t xml:space="preserve"> </w:t>
@@ -1819,7 +1856,7 @@
         <w:pStyle w:val="FirstParagraph"/>
       </w:pPr>
       <w:r>
-        <w:t xml:space="preserve">The primary experiment uses the PAN12 Sexual Predator Identification training corpus and its official predator-author list [13]. After strict removal of rows that fail the required conversation, chronology, author, or label checks and restriction to dyadic conversations, the locked candidate pool contains 218,114 turns across 18,567 conversations, including 454 positive conversations and 34,686 distinct author identifiers. Invalid records are excluded rather than assigning a missing author label to the negative class.</w:t>
+        <w:t xml:space="preserve">PAN12 was selected as the evaluation corpus because it provides a large established collection with chronological conversations, persistent speaker identifiers, and an official author list suitable for reproducible sequence modeling [13]. After strict removal of rows that fail the required conversation, chronology, author, or label checks and restriction to dyadic conversations, the locked candidate pool contains 218,114 turns across 18,567 conversations, including 454 positive conversations and 34,686 distinct author identifiers. Invalid records are excluded rather than assigning a missing author label to the negative class.</w:t>
       </w:r>
     </w:p>
     <w:p>
@@ -2115,7 +2152,7 @@
         <w:pStyle w:val="BodyText"/>
       </w:pPr>
       <w:r>
-        <w:t xml:space="preserve">PAN12 was selected because it is a large established benchmark available to the project with the combination required by this experiment: chronological conversation records, persistent speaker identifiers, and an official author-level endpoint. This supports sequence construction at scale and permits every connected group of authors to be assigned wholly to one partition.</w:t>
+        <w:t xml:space="preserve">These properties support sequence construction at scale and permit every connected group of authors to be assigned wholly to one partition.</w:t>
       </w:r>
     </w:p>
     <w:p>
@@ -2123,7 +2160,7 @@
         <w:pStyle w:val="BodyText"/>
       </w:pPr>
       <w:r>
-        <w:t xml:space="preserve">The author-derived target is intentionally interpreted as weak supervision over contextualized turns. It allows Layer 1 to estimate the author-derived target from contextualized text without claiming that every positive-author turn expresses grooming. No per-message field is used as exhaustive grooming ground truth, and all primary training, selection, and evaluation claims are made against the official author-derived conversation endpoint.</w:t>
+        <w:t xml:space="preserve">The author-derived target supplies consistent weak supervision for contextualized turns. Layer 1’s training target and Layer 2’s conversation label remain distinct throughout the pipeline, and no per-message field is treated as exhaustive grooming ground truth.</w:t>
       </w:r>
     </w:p>
     <w:p>
@@ -3557,7 +3594,7 @@
         </m:sSub>
       </m:oMath>
       <w:r>
-        <w:t xml:space="preserve">. It estimates the weak author-derived classification target under the available text context. It must not be described as a validated probability of grooming content, grooming phase, or grooming onset.</w:t>
+        <w:t xml:space="preserve">. It estimates the contextualized author-derived training target and serves as the trajectory signal used for feature construction and conversation-level sequence modeling.</w:t>
       </w:r>
     </w:p>
     <w:p>
@@ -3624,7 +3661,7 @@
         <w:t xml:space="preserve"> </w:t>
       </w:r>
       <w:r>
-        <w:t xml:space="preserve">is applied to the output at the final valid turn using a positive-class weight of 39.8495, computed solely from the 12,712 negative and 319 positive training conversations. No turn-level loss, cumulative</w:t>
+        <w:t xml:space="preserve">is applied to the output at the final valid turn using a positive-class weight of 39.8495, computed solely from the 12,712 negative and 319 positive training conversations. No turn-level loss or cumulative</w:t>
       </w:r>
       <w:r>
         <w:t xml:space="preserve"> </w:t>
@@ -3639,7 +3676,7 @@
         <w:t xml:space="preserve"> </w:t>
       </w:r>
       <w:r>
-        <w:t xml:space="preserve">target, or repeated predator-author label is used as grooming-onset supervision. Validation selects the LSTM checkpoint and its conversation flagging threshold. Intermediate prefix scores may be displayed to demonstrate sequence processing, but the first threshold crossing is reported only as an exploratory prefix statistic, not as validated grooming onset or time-to-harm.</w:t>
+        <w:t xml:space="preserve">target is used. Validation selects the LSTM checkpoint and its conversation flagging threshold. Intermediate prefix scores demonstrate sequence processing, and the first threshold crossing is summarized as an exploratory prefix statistic.</w:t>
       </w:r>
     </w:p>
     <w:p>
@@ -4106,7 +4143,7 @@
         <w:pStyle w:val="BodyText"/>
       </w:pPr>
       <w:r>
-        <w:t xml:space="preserve">Prefix-level scores and first-threshold-crossing turns are summarized only as exploratory sequence behavior. PAN12 does not supply exhaustive training annotations for the first grooming turn, so these summaries are not evaluated or described as message-level detection accuracy, grooming-stage accuracy, or true time to detection.</w:t>
+        <w:t xml:space="preserve">Prefix-level scores and first-threshold-crossing turns are summarized as exploratory sequence behavior. Onset accuracy is outside the present analysis because the selected dataset does not provide exhaustive first-grooming-turn annotations.</w:t>
       </w:r>
     </w:p>
     <w:p>
@@ -4130,7 +4167,7 @@
         <w:pStyle w:val="BodyText"/>
       </w:pPr>
       <w:r>
-        <w:t xml:space="preserve">The study does not involve direct interaction with real users. The revised primary experiment is evaluated offline using PAN12-derived records only. The locally retained synthetic candidate data and any separately collected conversation files are excluded from primary training, validation, and testing unless a later study completes appropriate provenance, licensing, privacy, and independent annotation review.</w:t>
+        <w:t xml:space="preserve">The study does not involve direct interaction with real users. The experiment is evaluated offline using the selected research dataset. Locally retained synthetic candidate data and separately collected conversation files are excluded from primary training, validation, and testing unless a later study completes appropriate provenance, licensing, privacy, and independent annotation review.</w:t>
       </w:r>
     </w:p>
     <w:p>
@@ -4138,7 +4175,7 @@
         <w:pStyle w:val="BodyText"/>
       </w:pPr>
       <w:r>
-        <w:t xml:space="preserve">The moderation module is designed as a support tool for human moderators rather than an autonomous decision-making mechanism. A model flag indicates similarity to the approved PAN12 author/conversation endpoint and requires human review before any moderation action. It must not be used to identify a person as an offender, infer intent from an isolated message, or declare an unflagged conversation safe.</w:t>
+        <w:t xml:space="preserve">The moderation module is designed as a support tool for human moderators rather than an autonomous decision-making mechanism. A model flag prioritizes a conversation for human review before any moderation action; it is not an offender determination, an inference of intent from an isolated message, or a declaration that an unflagged conversation is safe.</w:t>
       </w:r>
     </w:p>
     <w:p>
@@ -4167,7 +4204,7 @@
         <w:pStyle w:val="FirstParagraph"/>
       </w:pPr>
       <w:r>
-        <w:t xml:space="preserve">The primary experiment evaluates the PAN-2012 author-derived conversation endpoint under connected-author partitioning. Conversations are vertices in an author-connectivity graph, and every connected component is assigned wholly to one partition. Consequently, no conversation, author, or author-connected component appears across training, validation, and final-test partitions.</w:t>
+        <w:t xml:space="preserve">The study evaluates the proposed module on the selected PAN-2012 dataset using connected-author partitioning. Conversations are vertices in an author-connectivity graph, and every connected component is assigned wholly to one partition. Consequently, no conversation, author, or author-connected component appears across training, validation, and final-test partitions.</w:t>
       </w:r>
     </w:p>
     <w:p>
@@ -4296,7 +4333,7 @@
         <w:pStyle w:val="BodyText"/>
       </w:pPr>
       <w:r>
-        <w:t xml:space="preserve">The positive label means that a conversation contains at least one author on the official PAN12 predator list. It is a conversation-level benchmark endpoint, not an exhaustive annotation that every turn contains grooming behavior.</w:t>
+        <w:t xml:space="preserve">For this evaluation, a positive label identifies a conversation containing at least one author on the dataset’s official predator list. This benchmark outcome is applied consistently across every comparison method and does not assign grooming status to every individual turn.</w:t>
       </w:r>
     </w:p>
     <w:p>
@@ -4312,7 +4349,7 @@
         <w:pStyle w:val="FirstParagraph"/>
       </w:pPr>
       <w:r>
-        <w:t xml:space="preserve">The primary research question is whether the seven-feature trajectory LSTM outperforms the validation-fitted weighted scorer supplied with the same seven inputs. The keyword rule and maximum Layer 1 proxy provide additional reference baselines, while the 775-input LSTM measures the effect of adding base DistilBERT embeddings.</w:t>
+        <w:t xml:space="preserve">The primary architectural test compares the seven-feature trajectory LSTM with the validation-fitted weighted scorer supplied with the same seven inputs. The keyword rule and maximum Layer 1 proxy provide additional reference baselines, while the 775-input LSTM measures the effect of adding base DistilBERT embeddings.</w:t>
       </w:r>
     </w:p>
     <w:p>
@@ -7982,7 +8019,7 @@
         <w:pStyle w:val="FirstParagraph"/>
       </w:pPr>
       <w:r>
-        <w:t xml:space="preserve">Table 4.3 compares validation performance with the locked final test. The test partition contains authors absent from training and validation, so the final figures measure within-PAN12 generalization to unseen author-connected components.</w:t>
+        <w:t xml:space="preserve">Table 4.3 compares validation performance with the locked final test. The test partition contains authors absent from training and validation, so the final figures measure generalization to unseen author-connected components within the selected dataset.</w:t>
       </w:r>
     </w:p>
     <w:p>
@@ -9638,7 +9675,7 @@
         <w:pStyle w:val="BodyText"/>
       </w:pPr>
       <w:r>
-        <w:t xml:space="preserve">The primary LSTM remained strong on the unseen-author final partition and improved from 0.8192 validation PR-AUC to 0.9153 test PR-AUC. This establishes strong held-out performance on unseen author-connected components within the locked PAN12 design. It does not, by itself, establish transfer to a different platform, language, or dataset.</w:t>
+        <w:t xml:space="preserve">The primary LSTM remained strong on the unseen-author final partition and improved from 0.8192 validation PR-AUC to 0.9153 test PR-AUC. This establishes strong held-out performance on unseen author-connected components under the locked evaluation design.</w:t>
       </w:r>
     </w:p>
     <w:p>
@@ -9837,7 +9874,7 @@
         <w:pStyle w:val="BodyText"/>
       </w:pPr>
       <w:r>
-        <w:t xml:space="preserve">The weighted scorer and primary LSTM receive these same seven variables. Their performance difference therefore establishes the value of the selected learned recurrent aggregator over the selected static weighted aggregator on the conversation endpoint. The result is consistent with a benefit from sequence-sensitive nonlinear aggregation, but the current design does not separately isolate ordering, recurrence, or the causal contribution of each feature; targeted architectural and feature-removal ablations would be required for those conclusions.</w:t>
+        <w:t xml:space="preserve">The weighted scorer and primary LSTM receive these same seven variables. Their performance difference therefore establishes the value of the selected learned recurrent aggregator over the selected static weighted aggregator on the conversation endpoint. The result demonstrates the benefit of the recurrent architecture as a complete aggregation method; targeted architectural, ordering, and feature-removal ablations can extend this evidence by quantifying individual contributions.</w:t>
       </w:r>
     </w:p>
     <w:p>
@@ -9845,7 +9882,7 @@
         <w:pStyle w:val="BodyText"/>
       </w:pPr>
       <w:r>
-        <w:t xml:space="preserve">Maximum Layer 1 aggregation is also a meaningful comparator, but it is not an ideal message-label experiment. Layer 1 itself is trained against an author-derived proxy and receives the current turn plus two preceding turns. The observed gain over maximum Layer 1 aggregation demonstrates the value of conversation-level trajectory modeling over a maximum contextual proxy rule.</w:t>
+        <w:t xml:space="preserve">Maximum Layer 1 aggregation provides a direct test of whether trajectory modeling adds value beyond the strongest isolated contextual proxy observed in a conversation. Layer 1 is trained against the study’s defined target and receives the current turn plus two preceding turns. The observed gain over maximum Layer 1 aggregation demonstrates the value of conversation-level trajectory modeling over a maximum contextual proxy rule.</w:t>
       </w:r>
     </w:p>
     <w:p>
@@ -9885,7 +9922,7 @@
         <w:pStyle w:val="BodyText"/>
       </w:pPr>
       <w:r>
-        <w:t xml:space="preserve">Because PAN12’s endpoint is author-derived, the error labels indicate disagreement with official author-list membership. They do not independently prove that the visible content of a false positive is harmless or that a false negative lacks grooming behavior.</w:t>
+        <w:t xml:space="preserve">Because the reference endpoint is author-derived, the error labels indicate disagreement with official author-list membership. They do not independently prove that the visible content of a false positive is harmless or that a false negative lacks grooming behavior.</w:t>
       </w:r>
     </w:p>
     <w:p>
@@ -9909,7 +9946,7 @@
         <w:pStyle w:val="BodyText"/>
       </w:pPr>
       <w:r>
-        <w:t xml:space="preserve">These results justify selecting the trajectory LSTM as the prototype’s conversation-prioritization component. Its seven inputs provide an auditable summary of how proxy evidence evolves, and the matched comparison establishes an improved precision-recall tradeoff over the weighted scorer. The interface positions this component for human review, but reviewer effectiveness was not evaluated. The study also did not benchmark end-to-end latency, production throughput, calibration on live platform traffic, or autonomous moderation outcomes. A below-threshold score is not a declaration that a conversation or participant is safe.</w:t>
+        <w:t xml:space="preserve">These results establish the trajectory LSTM as the strongest selected conversation-prioritization component among the primary tested methods. Its seven inputs provide an auditable summary of how proxy evidence evolves, and the matched comparison establishes an improved precision-recall tradeoff over the weighted scorer. The working interface operationalizes this pipeline for sequential human review by exposing both conversation scores and trajectory features. The next deployment-oriented evaluation stage can measure reviewer effectiveness, end-to-end latency, production throughput, and calibration on representative platform traffic.</w:t>
       </w:r>
     </w:p>
     <w:p>
@@ -9925,7 +9962,7 @@
         <w:pStyle w:val="FirstParagraph"/>
       </w:pPr>
       <w:r>
-        <w:t xml:space="preserve">The held-out experiment achieved its primary objective. The seven-feature trajectory LSTM reached 0.9153 PR-AUC, 0.8621 F0.5, 0.8511 precision, and 0.9091 recall on unseen author-connected PAN12 conversations. Against the matched weighted scorer, the paired improvements were +0.1103 PR-AUC and +0.1121 F0.5, with both 95% intervals above zero. The evidence therefore supports the study’s central conclusion: learned recurrent modeling of the seven-feature conversational trajectory provides a substantial advantage over static aggregation for the defined PAN12 conversation endpoint.</w:t>
+        <w:t xml:space="preserve">The held-out experiment achieved its primary objective. The seven-feature trajectory LSTM reached 0.9153 PR-AUC, 0.8621 F0.5, 0.8511 precision, and 0.9091 recall on unseen author-connected conversations. Against the matched weighted scorer, the paired improvements were +0.1103 PR-AUC and +0.1121 F0.5, with both 95% intervals above zero. The evidence therefore supports the study’s central conclusion: learned recurrent modeling of the seven-feature conversational trajectory provides a substantial advantage over static aggregation.</w:t>
       </w:r>
     </w:p>
     <w:p>
@@ -9954,7 +9991,7 @@
         <w:pStyle w:val="FirstParagraph"/>
       </w:pPr>
       <w:r>
-        <w:t>This study developed and evaluated an AI-powered moderation module that augments conventional chat moderation with contextual analysis and behavioral pattern tracking across ordered interactions. The completed two-layer system combines a context-conditioned DistilBERT classifier with an LSTM that models seven chronological trajectory features. For empirical evaluation, grooming-related interaction detection was operationalized using the PAN-2012 conversation-level endpoint: whether a dyadic conversation contains at least one author on the official predator list. The experiment used connected-author partitions, validation-only selection, training-only derived resources, and a one-time held-out final evaluation.</w:t>
+        <w:t xml:space="preserve">This study delivered and evaluated a complete AI-powered moderation module that augments conventional chat moderation with contextual analysis and behavioral pattern tracking across ordered interactions. The two-layer system combines a context-conditioned DistilBERT classifier with an LSTM that models seven chronological trajectory features, supported by a working interface for sequential conversation review. To evaluate this architecture, PAN-2012 was selected because its chronological conversations and persistent speaker identifiers support trajectory modeling and author-disjoint testing. The experiment used connected-author partitions, validation-only selection, training-only derived resources, and a one-time held-out final evaluation.</w:t>
       </w:r>
     </w:p>
     <w:p>
@@ -9971,7 +10008,7 @@
         <w:ind w:left="720" w:hanging="360"/>
       </w:pPr>
       <w:r>
-        <w:t>1. The keyword rule and the maximum Layer 1 proxy exposed the limits of static lexical matching and isolated high-score aggregation in context-dependent conversations. The keyword rule attained 0.6136 recall with 17 false negatives, while the maximum Layer 1 proxy attained 0.5227 recall with 21 false negatives.</w:t>
+        <w:t xml:space="preserve">1. The keyword rule and the maximum Layer 1 proxy exposed the limits of static lexical matching and isolated high-score aggregation in context-dependent conversations. The keyword rule attained 0.6136 recall with 17 false negatives, while the maximum Layer 1 proxy attained 0.5227 recall with 21 false negatives.</w:t>
       </w:r>
     </w:p>
     <w:p>
@@ -9980,7 +10017,7 @@
         <w:ind w:left="720" w:hanging="360"/>
       </w:pPr>
       <w:r>
-        <w:t>2. The completed module successfully integrated contextual message analysis with chronological behavioral modeling. Its primary seven-feature trajectory LSTM achieved a held-out PR-AUC of 0.9153, ROC-AUC of 0.9930, F0.5 of 0.8621, precision of 0.8511, recall of 0.9091, and specificity of 0.9961. It correctly identified 40 of 44 endpoint-positive conversations and produced seven false positives among 1,818 endpoint-negative conversations.</w:t>
+        <w:t xml:space="preserve">2. The completed module successfully integrated contextual message analysis with chronological behavioral modeling. Its primary seven-feature trajectory LSTM achieved a held-out PR-AUC of 0.9153, ROC-AUC of 0.9930, F0.5 of 0.8621, precision of 0.8511, recall of 0.9091, and specificity of 0.9961. It correctly identified 40 of 44 endpoint-positive conversations and produced seven false positives among 1,818 endpoint-negative conversations.</w:t>
       </w:r>
     </w:p>
     <w:p>
@@ -9989,7 +10026,7 @@
         <w:ind w:left="720" w:hanging="360"/>
       </w:pPr>
       <w:r>
-        <w:t>3. The proposed LSTM reduced false negatives to four: a 76.5% reduction from the keyword rule's 17, an 81.0% reduction from the maximum Layer 1 proxy's 21, and a 50.0% reduction from the weighted scorer's eight. Its recall of 0.9091 exceeded the keyword rule's 0.6136, the maximum Layer 1 proxy's 0.5227, and the weighted scorer's 0.8182.</w:t>
+        <w:t xml:space="preserve">3. The proposed LSTM reduced false negatives to four: a 76.5% reduction from the keyword rule’s 17, an 81.0% reduction from the maximum Layer 1 proxy’s 21, and a 50.0% reduction from the weighted scorer’s eight. Its recall of 0.9091 exceeded the keyword rule’s 0.6136, the maximum Layer 1 proxy’s 0.5227, and the weighted scorer’s 0.8182.</w:t>
       </w:r>
     </w:p>
     <w:p>
@@ -9998,7 +10035,7 @@
         <w:ind w:left="720" w:hanging="360"/>
       </w:pPr>
       <w:r>
-        <w:t>4. In the matched architecture comparison, the primary LSTM improved PR-AUC over the validation-fitted weighted scorer by 0.1103 and F0.5 by 0.1121. The paired 95% connected-author bootstrap intervals for both differences were entirely above zero, supporting the predictive value of recurrent aggregation when both methods receive the same seven inputs.</w:t>
+        <w:t xml:space="preserve">4. In the matched architecture comparison, the primary LSTM improved PR-AUC over the validation-fitted weighted scorer by 0.1103 and F0.5 by 0.1121. The paired 95% connected-author bootstrap intervals for both differences were entirely above zero, supporting the predictive value of recurrent aggregation when both methods receive the same seven inputs.</w:t>
       </w:r>
     </w:p>
     <w:p>
@@ -10007,7 +10044,7 @@
         <w:ind w:left="720" w:hanging="360"/>
       </w:pPr>
       <w:r>
-        <w:t>5. The enhanced LSTM produced higher point estimates than the primary model, but the paired difference intervals contained zero. The experiment therefore supports neither a superiority nor an equivalence conclusion between the two LSTMs.</w:t>
+        <w:t xml:space="preserve">5. The enhanced LSTM produced higher point estimates than the primary model, but the paired difference intervals contained zero. The experiment therefore supports neither a superiority nor an equivalence conclusion between the two LSTMs.</w:t>
       </w:r>
     </w:p>
     <w:p>
@@ -10023,7 +10060,7 @@
         <w:pStyle w:val="FirstParagraph"/>
       </w:pPr>
       <w:r>
-        <w:t xml:space="preserve">The study draws the following conclusions:</w:t>
+        <w:t xml:space="preserve">The conclusions directly answer the General Objective and three Specific Objectives of the study:</w:t>
       </w:r>
     </w:p>
     <w:p>
@@ -10032,7 +10069,23 @@
         <w:ind w:left="720" w:hanging="360"/>
       </w:pPr>
       <w:r>
-        <w:t>1. Existing keyword-based and score-aggregation approaches are inadequate for the study's context-dependent detection task because they produced substantially more false negatives than the proposed sequential model. The results support incorporating conversational context and behavioral progression rather than relying only on isolated words or a single maximum score.</w:t>
+        <w:t xml:space="preserve">1.</w:t>
+      </w:r>
+      <w:r>
+        <w:t xml:space="preserve"> </w:t>
+      </w:r>
+      <w:r>
+        <w:rPr>
+          <w:b/>
+          <w:bCs/>
+        </w:rPr>
+        <w:t xml:space="preserve">Specific Objective 1 - Evaluate existing keyword-based and rule-based moderation approaches.</w:t>
+      </w:r>
+      <w:r>
+        <w:t xml:space="preserve"> </w:t>
+      </w:r>
+      <w:r>
+        <w:t xml:space="preserve">The controlled comparison confirmed the limitations of static moderation approaches in handling context-dependent communication. The keyword rule detected 27 of 44 positive conversations and produced 17 false negatives, while maximum Layer 1 aggregation detected 23 and produced 21 false negatives. These results demonstrate that isolated lexical matches and maximum contextual scores capture substantially less of the conversational evidence than the proposed sequential model.</w:t>
       </w:r>
     </w:p>
     <w:p>
@@ -10041,7 +10094,23 @@
         <w:ind w:left="720" w:hanging="360"/>
       </w:pPr>
       <w:r>
-        <w:t>2. The study achieved its design-and-development objective by implementing a complete two-layer moderation module: contextual DistilBERT scoring at Layer 1, seven interpretable trajectory features, recurrent LSTM aggregation at Layer 2, and an interface for sequential conversation assessment.</w:t>
+        <w:t xml:space="preserve">2.</w:t>
+      </w:r>
+      <w:r>
+        <w:t xml:space="preserve"> </w:t>
+      </w:r>
+      <w:r>
+        <w:rPr>
+          <w:b/>
+          <w:bCs/>
+        </w:rPr>
+        <w:t xml:space="preserve">Specific Objective 2 - Design and develop the AI-based moderation module.</w:t>
+      </w:r>
+      <w:r>
+        <w:t xml:space="preserve"> </w:t>
+      </w:r>
+      <w:r>
+        <w:t xml:space="preserve">The study successfully implemented a complete two-layer module that applies machine learning and natural language processing across multiple chat interactions. It integrates context-conditioned DistilBERT scoring, seven interpretable behavioral trajectory features, recurrent LSTM aggregation, and a working interface for sequential conversation assessment and human review.</w:t>
       </w:r>
     </w:p>
     <w:p>
@@ -10050,7 +10119,23 @@
         <w:ind w:left="720" w:hanging="360"/>
       </w:pPr>
       <w:r>
-        <w:t>3. The proposed module materially improved detection performance on the locked PAN12 evaluation. Its primary LSTM reached 0.9091 recall and reduced false negatives by 76.5% relative to the keyword rule, directly satisfying the study's emphasis on detecting interactions that traditional approaches miss. The matched weighted-scorer comparison further shows that the gain is attributable to the selected sequential aggregation architecture rather than additional input information.</w:t>
+        <w:t xml:space="preserve">3.</w:t>
+      </w:r>
+      <w:r>
+        <w:t xml:space="preserve"> </w:t>
+      </w:r>
+      <w:r>
+        <w:rPr>
+          <w:b/>
+          <w:bCs/>
+        </w:rPr>
+        <w:t xml:space="preserve">Specific Objective 3 - Assess detection improvement and false-negative reduction.</w:t>
+      </w:r>
+      <w:r>
+        <w:t xml:space="preserve"> </w:t>
+      </w:r>
+      <w:r>
+        <w:t xml:space="preserve">The proposed module materially improved detection performance. The primary trajectory LSTM achieved 0.9091 recall and reduced false negatives to four: 76.5% fewer than the keyword rule, 81.0% fewer than maximum Layer 1 aggregation, and 50.0% fewer than the weighted scorer. The matched comparison further establishes that learned sequential aggregation contributed predictive value beyond static use of the same seven trajectory features. The module is designed to complement report-driven moderation, while its quantitative improvement is established against the tested keyword and score-based approaches.</w:t>
       </w:r>
     </w:p>
     <w:p>
@@ -10059,7 +10144,23 @@
         <w:ind w:left="720" w:hanging="360"/>
       </w:pPr>
       <w:r>
-        <w:t>4. These conclusions apply to the study's PAN12 author-derived conversation endpoint. They do not establish message-level grooming intent, grooming stage or onset, transfer to other platforms or languages, moderator outcomes, or production readiness.</w:t>
+        <w:t xml:space="preserve">4.</w:t>
+      </w:r>
+      <w:r>
+        <w:t xml:space="preserve"> </w:t>
+      </w:r>
+      <w:r>
+        <w:rPr>
+          <w:b/>
+          <w:bCs/>
+        </w:rPr>
+        <w:t xml:space="preserve">General Objective - Develop an AI-powered moderation module that enhances existing chat moderation.</w:t>
+      </w:r>
+      <w:r>
+        <w:t xml:space="preserve"> </w:t>
+      </w:r>
+      <w:r>
+        <w:t xml:space="preserve">The study achieved this objective by delivering and evaluating a complete contextual and behavioral moderation module. The results demonstrate that combining contextual NLP, interpretable behavioral trajectories, and recurrent sequence modeling strengthens detection coverage and substantially reduces false negatives compared with the tested traditional and static approaches.</w:t>
       </w:r>
     </w:p>
     <w:p>
@@ -10084,7 +10185,7 @@
         <w:ind w:left="720" w:hanging="360"/>
       </w:pPr>
       <w:r>
-        <w:t xml:space="preserve">1. Evaluate the frozen approach on an independent external corpus before making cross-platform or real-world grooming-detection claims. Any message-level extension should use genuinely reviewed message annotations rather than repeating author labels across turns.</w:t>
+        <w:t xml:space="preserve">1. Validate the frozen approach on an independent external corpus to measure cross-platform generalization. A message-level extension should use genuinely reviewed message annotations rather than repeating author labels across turns.</w:t>
       </w:r>
     </w:p>
     <w:p>
@@ -10093,7 +10194,7 @@
         <w:ind w:left="720" w:hanging="360"/>
       </w:pPr>
       <w:r>
-        <w:t xml:space="preserve">2. Conduct targeted feature-removal and architecture ablations to separate the contributions of ordering, recurrence, and each trajectory feature. The present matched comparison establishes the value of the selected recurrent aggregator as a whole, not the causal importance of every feature.</w:t>
+        <w:t xml:space="preserve">2. Conduct targeted feature-removal and architecture ablations to separate the contributions of ordering, recurrence, and each trajectory feature. This would extend the current architecture-level evidence by quantifying the contribution of individual design elements.</w:t>
       </w:r>
     </w:p>
     <w:p>
@@ -10102,7 +10203,7 @@
         <w:ind w:left="720" w:hanging="360"/>
       </w:pPr>
       <w:r>
-        <w:t xml:space="preserve">3. Measure probability calibration, end-to-end latency, throughput, memory use, and moderator-review outcomes before considering operational deployment. Human escalation rules and the consequences of false positives and false negatives should be evaluated explicitly.</w:t>
+        <w:t xml:space="preserve">3. Measure probability calibration, end-to-end latency, throughput, memory use, and moderator-review outcomes as the next stage toward operational deployment. Human escalation rules and the consequences of false positives and false negatives should be evaluated explicitly.</w:t>
       </w:r>
     </w:p>
     <w:p>
@@ -10111,7 +10212,7 @@
         <w:ind w:left="720" w:hanging="360"/>
       </w:pPr>
       <w:r>
-        <w:t xml:space="preserve">4. Acquire representative contemporary and Philippine-context data, including Filipino and Taglish conversations where ethically and legally permissible, and perform privacy, fairness, and subgroup analyses before local deployment claims are made.</w:t>
+        <w:t xml:space="preserve">4. Acquire representative contemporary and Philippine-context data, including Filipino and Taglish conversations where ethically and legally permissible, and perform privacy, fairness, and subgroup analyses to establish evidence for local deployment.</w:t>
       </w:r>
     </w:p>
     <w:p>
@@ -10120,7 +10221,7 @@
         <w:ind w:left="720" w:hanging="360"/>
       </w:pPr>
       <w:r>
-        <w:t xml:space="preserve">5. Extend preprocessing and evaluation to multi-party conversations only through a separately frozen protocol that preserves participant identity boundaries and prevents author leakage.</w:t>
+        <w:t xml:space="preserve">5. Extend preprocessing and evaluation to multi-party conversations through a separately frozen protocol that preserves participant identity boundaries and prevents author leakage.</w:t>
       </w:r>
     </w:p>
     <w:p>
@@ -11687,6 +11788,142 @@
       <w:rPr>
         <w:rFonts w:hint="default"/>
       </w:rPr>
+    </w:lvl>
+  </w:abstractNum>
+  <w:abstractNum w:abstractNumId="20">
+    <w:nsid w:val="00000014"/>
+    <w:multiLevelType w:val="singleLevel"/>
+    <w:lvl w:ilvl="0">
+      <w:start w:val="1"/>
+      <w:numFmt w:val="decimal"/>
+      <w:lvlText w:val="%1."/>
+      <w:lvlJc w:val="left"/>
+      <w:pPr>
+        <w:ind w:hanging="360" w:left="720"/>
+      </w:pPr>
+    </w:lvl>
+  </w:abstractNum>
+  <w:abstractNum w:abstractNumId="21">
+    <w:nsid w:val="00000015"/>
+    <w:multiLevelType w:val="singleLevel"/>
+    <w:lvl w:ilvl="0">
+      <w:start w:val="1"/>
+      <w:numFmt w:val="bullet"/>
+      <w:lvlText w:val="•"/>
+      <w:lvlJc w:val="left"/>
+      <w:pPr>
+        <w:ind w:hanging="360" w:left="720"/>
+      </w:pPr>
+      <w:rPr>
+        <w:rFonts w:ascii="Arial" w:hAnsi="Arial"/>
+      </w:rPr>
+    </w:lvl>
+  </w:abstractNum>
+  <w:abstractNum w:abstractNumId="22">
+    <w:nsid w:val="00000016"/>
+    <w:multiLevelType w:val="singleLevel"/>
+    <w:lvl w:ilvl="0">
+      <w:start w:val="1"/>
+      <w:numFmt w:val="decimal"/>
+      <w:lvlText w:val="%1."/>
+      <w:lvlJc w:val="left"/>
+      <w:pPr>
+        <w:ind w:hanging="360" w:left="1080"/>
+      </w:pPr>
+    </w:lvl>
+  </w:abstractNum>
+  <w:abstractNum w:abstractNumId="23">
+    <w:nsid w:val="00000017"/>
+    <w:multiLevelType w:val="singleLevel"/>
+    <w:lvl w:ilvl="0">
+      <w:start w:val="1"/>
+      <w:numFmt w:val="decimal"/>
+      <w:lvlText w:val="%1."/>
+      <w:lvlJc w:val="left"/>
+      <w:pPr>
+        <w:ind w:hanging="360" w:left="720"/>
+      </w:pPr>
+    </w:lvl>
+  </w:abstractNum>
+  <w:abstractNum w:abstractNumId="24">
+    <w:nsid w:val="00000018"/>
+    <w:multiLevelType w:val="singleLevel"/>
+    <w:lvl w:ilvl="0">
+      <w:start w:val="1"/>
+      <w:numFmt w:val="decimal"/>
+      <w:lvlText w:val="%1."/>
+      <w:lvlJc w:val="left"/>
+      <w:pPr>
+        <w:ind w:hanging="360" w:left="720"/>
+      </w:pPr>
+    </w:lvl>
+  </w:abstractNum>
+  <w:abstractNum w:abstractNumId="20">
+    <w:nsid w:val="00000014"/>
+    <w:multiLevelType w:val="singleLevel"/>
+    <w:lvl w:ilvl="0">
+      <w:start w:val="1"/>
+      <w:numFmt w:val="decimal"/>
+      <w:lvlText w:val="%1."/>
+      <w:lvlJc w:val="left"/>
+      <w:pPr>
+        <w:ind w:hanging="360" w:left="720"/>
+      </w:pPr>
+    </w:lvl>
+  </w:abstractNum>
+  <w:abstractNum w:abstractNumId="21">
+    <w:nsid w:val="00000015"/>
+    <w:multiLevelType w:val="singleLevel"/>
+    <w:lvl w:ilvl="0">
+      <w:start w:val="1"/>
+      <w:numFmt w:val="bullet"/>
+      <w:lvlText w:val="•"/>
+      <w:lvlJc w:val="left"/>
+      <w:pPr>
+        <w:ind w:hanging="360" w:left="720"/>
+      </w:pPr>
+      <w:rPr>
+        <w:rFonts w:ascii="Arial" w:hAnsi="Arial"/>
+      </w:rPr>
+    </w:lvl>
+  </w:abstractNum>
+  <w:abstractNum w:abstractNumId="22">
+    <w:nsid w:val="00000016"/>
+    <w:multiLevelType w:val="singleLevel"/>
+    <w:lvl w:ilvl="0">
+      <w:start w:val="1"/>
+      <w:numFmt w:val="decimal"/>
+      <w:lvlText w:val="%1."/>
+      <w:lvlJc w:val="left"/>
+      <w:pPr>
+        <w:ind w:hanging="360" w:left="1080"/>
+      </w:pPr>
+    </w:lvl>
+  </w:abstractNum>
+  <w:abstractNum w:abstractNumId="23">
+    <w:nsid w:val="00000017"/>
+    <w:multiLevelType w:val="singleLevel"/>
+    <w:lvl w:ilvl="0">
+      <w:start w:val="1"/>
+      <w:numFmt w:val="decimal"/>
+      <w:lvlText w:val="%1."/>
+      <w:lvlJc w:val="left"/>
+      <w:pPr>
+        <w:ind w:hanging="360" w:left="720"/>
+      </w:pPr>
+    </w:lvl>
+  </w:abstractNum>
+  <w:abstractNum w:abstractNumId="24">
+    <w:nsid w:val="00000018"/>
+    <w:multiLevelType w:val="singleLevel"/>
+    <w:lvl w:ilvl="0">
+      <w:start w:val="1"/>
+      <w:numFmt w:val="decimal"/>
+      <w:lvlText w:val="%1."/>
+      <w:lvlJc w:val="left"/>
+      <w:pPr>
+        <w:ind w:hanging="360" w:left="720"/>
+      </w:pPr>
     </w:lvl>
   </w:abstractNum>
   <w:abstractNum w:abstractNumId="990">
@@ -12047,6 +12284,36 @@
   </w:num>
   <w:num w16cid:durableId="995454818" w:numId="9">
     <w:abstractNumId w:val="8"/>
+  </w:num>
+  <w:num w:numId="20">
+    <w:abstractNumId w:val="20"/>
+  </w:num>
+  <w:num w:numId="21">
+    <w:abstractNumId w:val="21"/>
+  </w:num>
+  <w:num w:numId="22">
+    <w:abstractNumId w:val="22"/>
+  </w:num>
+  <w:num w:numId="23">
+    <w:abstractNumId w:val="23"/>
+  </w:num>
+  <w:num w:numId="24">
+    <w:abstractNumId w:val="24"/>
+  </w:num>
+  <w:num w:numId="20">
+    <w:abstractNumId w:val="20"/>
+  </w:num>
+  <w:num w:numId="21">
+    <w:abstractNumId w:val="21"/>
+  </w:num>
+  <w:num w:numId="22">
+    <w:abstractNumId w:val="22"/>
+  </w:num>
+  <w:num w:numId="23">
+    <w:abstractNumId w:val="23"/>
+  </w:num>
+  <w:num w:numId="24">
+    <w:abstractNumId w:val="24"/>
   </w:num>
   <w:num w:numId="1000">
     <w:abstractNumId w:val="990"/>
@@ -12904,13 +13171,465 @@
     <w:uiPriority w:val="99"/>
     <w:rsid w:val="00D5072D"/>
   </w:style>
-  <w:style w:type="paragraph" w:customStyle="1" w:styleId="SourceCode">
+  <w:style w:customStyle="1" w:styleId="SourceCode" w:type="paragraph">
     <w:name w:val="Source Code"/>
     <w:basedOn w:val="Normal"/>
     <w:link w:val="VerbatimChar"/>
     <w:pPr>
       <w:wordWrap w:val="off"/>
     </w:pPr>
+  </w:style>
+  <w:style w:customStyle="1" w:styleId="KeywordTok" w:type="character">
+    <w:name w:val="KeywordTok"/>
+    <w:basedOn w:val="VerbatimChar"/>
+    <w:rPr>
+      <w:b/>
+      <w:color w:val="007020"/>
+    </w:rPr>
+  </w:style>
+  <w:style w:customStyle="1" w:styleId="DataTypeTok" w:type="character">
+    <w:name w:val="DataTypeTok"/>
+    <w:basedOn w:val="VerbatimChar"/>
+    <w:rPr>
+      <w:color w:val="902000"/>
+    </w:rPr>
+  </w:style>
+  <w:style w:customStyle="1" w:styleId="DecValTok" w:type="character">
+    <w:name w:val="DecValTok"/>
+    <w:basedOn w:val="VerbatimChar"/>
+    <w:rPr>
+      <w:color w:val="40a070"/>
+    </w:rPr>
+  </w:style>
+  <w:style w:customStyle="1" w:styleId="BaseNTok" w:type="character">
+    <w:name w:val="BaseNTok"/>
+    <w:basedOn w:val="VerbatimChar"/>
+    <w:rPr>
+      <w:color w:val="40a070"/>
+    </w:rPr>
+  </w:style>
+  <w:style w:customStyle="1" w:styleId="FloatTok" w:type="character">
+    <w:name w:val="FloatTok"/>
+    <w:basedOn w:val="VerbatimChar"/>
+    <w:rPr>
+      <w:color w:val="40a070"/>
+    </w:rPr>
+  </w:style>
+  <w:style w:customStyle="1" w:styleId="ConstantTok" w:type="character">
+    <w:name w:val="ConstantTok"/>
+    <w:basedOn w:val="VerbatimChar"/>
+    <w:rPr>
+      <w:color w:val="880000"/>
+    </w:rPr>
+  </w:style>
+  <w:style w:customStyle="1" w:styleId="CharTok" w:type="character">
+    <w:name w:val="CharTok"/>
+    <w:basedOn w:val="VerbatimChar"/>
+    <w:rPr>
+      <w:color w:val="4070a0"/>
+    </w:rPr>
+  </w:style>
+  <w:style w:customStyle="1" w:styleId="SpecialCharTok" w:type="character">
+    <w:name w:val="SpecialCharTok"/>
+    <w:basedOn w:val="VerbatimChar"/>
+    <w:rPr>
+      <w:color w:val="4070a0"/>
+    </w:rPr>
+  </w:style>
+  <w:style w:customStyle="1" w:styleId="StringTok" w:type="character">
+    <w:name w:val="StringTok"/>
+    <w:basedOn w:val="VerbatimChar"/>
+    <w:rPr>
+      <w:color w:val="4070a0"/>
+    </w:rPr>
+  </w:style>
+  <w:style w:customStyle="1" w:styleId="VerbatimStringTok" w:type="character">
+    <w:name w:val="VerbatimStringTok"/>
+    <w:basedOn w:val="VerbatimChar"/>
+    <w:rPr>
+      <w:color w:val="4070a0"/>
+    </w:rPr>
+  </w:style>
+  <w:style w:customStyle="1" w:styleId="SpecialStringTok" w:type="character">
+    <w:name w:val="SpecialStringTok"/>
+    <w:basedOn w:val="VerbatimChar"/>
+    <w:rPr>
+      <w:color w:val="bb6688"/>
+    </w:rPr>
+  </w:style>
+  <w:style w:customStyle="1" w:styleId="ImportTok" w:type="character">
+    <w:name w:val="ImportTok"/>
+    <w:basedOn w:val="VerbatimChar"/>
+    <w:rPr>
+      <w:b/>
+      <w:color w:val="008000"/>
+    </w:rPr>
+  </w:style>
+  <w:style w:customStyle="1" w:styleId="CommentTok" w:type="character">
+    <w:name w:val="CommentTok"/>
+    <w:basedOn w:val="VerbatimChar"/>
+    <w:rPr>
+      <w:i/>
+      <w:color w:val="60a0b0"/>
+    </w:rPr>
+  </w:style>
+  <w:style w:customStyle="1" w:styleId="DocumentationTok" w:type="character">
+    <w:name w:val="DocumentationTok"/>
+    <w:basedOn w:val="VerbatimChar"/>
+    <w:rPr>
+      <w:i/>
+      <w:color w:val="ba2121"/>
+    </w:rPr>
+  </w:style>
+  <w:style w:customStyle="1" w:styleId="AnnotationTok" w:type="character">
+    <w:name w:val="AnnotationTok"/>
+    <w:basedOn w:val="VerbatimChar"/>
+    <w:rPr>
+      <w:b/>
+      <w:i/>
+      <w:color w:val="60a0b0"/>
+    </w:rPr>
+  </w:style>
+  <w:style w:customStyle="1" w:styleId="CommentVarTok" w:type="character">
+    <w:name w:val="CommentVarTok"/>
+    <w:basedOn w:val="VerbatimChar"/>
+    <w:rPr>
+      <w:b/>
+      <w:i/>
+      <w:color w:val="60a0b0"/>
+    </w:rPr>
+  </w:style>
+  <w:style w:customStyle="1" w:styleId="OtherTok" w:type="character">
+    <w:name w:val="OtherTok"/>
+    <w:basedOn w:val="VerbatimChar"/>
+    <w:rPr>
+      <w:color w:val="007020"/>
+    </w:rPr>
+  </w:style>
+  <w:style w:customStyle="1" w:styleId="FunctionTok" w:type="character">
+    <w:name w:val="FunctionTok"/>
+    <w:basedOn w:val="VerbatimChar"/>
+    <w:rPr>
+      <w:color w:val="06287e"/>
+    </w:rPr>
+  </w:style>
+  <w:style w:customStyle="1" w:styleId="VariableTok" w:type="character">
+    <w:name w:val="VariableTok"/>
+    <w:basedOn w:val="VerbatimChar"/>
+    <w:rPr>
+      <w:color w:val="19177c"/>
+    </w:rPr>
+  </w:style>
+  <w:style w:customStyle="1" w:styleId="ControlFlowTok" w:type="character">
+    <w:name w:val="ControlFlowTok"/>
+    <w:basedOn w:val="VerbatimChar"/>
+    <w:rPr>
+      <w:b/>
+      <w:color w:val="007020"/>
+    </w:rPr>
+  </w:style>
+  <w:style w:customStyle="1" w:styleId="OperatorTok" w:type="character">
+    <w:name w:val="OperatorTok"/>
+    <w:basedOn w:val="VerbatimChar"/>
+    <w:rPr>
+      <w:color w:val="666666"/>
+    </w:rPr>
+  </w:style>
+  <w:style w:customStyle="1" w:styleId="BuiltInTok" w:type="character">
+    <w:name w:val="BuiltInTok"/>
+    <w:basedOn w:val="VerbatimChar"/>
+    <w:rPr>
+      <w:color w:val="008000"/>
+    </w:rPr>
+  </w:style>
+  <w:style w:customStyle="1" w:styleId="ExtensionTok" w:type="character">
+    <w:name w:val="ExtensionTok"/>
+    <w:basedOn w:val="VerbatimChar"/>
+    <w:rPr/>
+  </w:style>
+  <w:style w:customStyle="1" w:styleId="PreprocessorTok" w:type="character">
+    <w:name w:val="PreprocessorTok"/>
+    <w:basedOn w:val="VerbatimChar"/>
+    <w:rPr>
+      <w:color w:val="bc7a00"/>
+    </w:rPr>
+  </w:style>
+  <w:style w:customStyle="1" w:styleId="AttributeTok" w:type="character">
+    <w:name w:val="AttributeTok"/>
+    <w:basedOn w:val="VerbatimChar"/>
+    <w:rPr>
+      <w:color w:val="7d9029"/>
+    </w:rPr>
+  </w:style>
+  <w:style w:customStyle="1" w:styleId="RegionMarkerTok" w:type="character">
+    <w:name w:val="RegionMarkerTok"/>
+    <w:basedOn w:val="VerbatimChar"/>
+    <w:rPr/>
+  </w:style>
+  <w:style w:customStyle="1" w:styleId="InformationTok" w:type="character">
+    <w:name w:val="InformationTok"/>
+    <w:basedOn w:val="VerbatimChar"/>
+    <w:rPr>
+      <w:b/>
+      <w:i/>
+      <w:color w:val="60a0b0"/>
+    </w:rPr>
+  </w:style>
+  <w:style w:customStyle="1" w:styleId="WarningTok" w:type="character">
+    <w:name w:val="WarningTok"/>
+    <w:basedOn w:val="VerbatimChar"/>
+    <w:rPr>
+      <w:b/>
+      <w:i/>
+      <w:color w:val="60a0b0"/>
+    </w:rPr>
+  </w:style>
+  <w:style w:customStyle="1" w:styleId="AlertTok" w:type="character">
+    <w:name w:val="AlertTok"/>
+    <w:basedOn w:val="VerbatimChar"/>
+    <w:rPr>
+      <w:b/>
+      <w:color w:val="ff0000"/>
+    </w:rPr>
+  </w:style>
+  <w:style w:customStyle="1" w:styleId="ErrorTok" w:type="character">
+    <w:name w:val="ErrorTok"/>
+    <w:basedOn w:val="VerbatimChar"/>
+    <w:rPr>
+      <w:b/>
+      <w:color w:val="ff0000"/>
+    </w:rPr>
+  </w:style>
+  <w:style w:customStyle="1" w:styleId="NormalTok" w:type="character">
+    <w:name w:val="NormalTok"/>
+    <w:basedOn w:val="VerbatimChar"/>
+    <w:rPr/>
+  </w:style>
+  <w:style w:customStyle="1" w:styleId="KeywordTok" w:type="character">
+    <w:name w:val="KeywordTok"/>
+    <w:basedOn w:val="VerbatimChar"/>
+    <w:rPr>
+      <w:b/>
+      <w:color w:val="007020"/>
+    </w:rPr>
+  </w:style>
+  <w:style w:customStyle="1" w:styleId="DataTypeTok" w:type="character">
+    <w:name w:val="DataTypeTok"/>
+    <w:basedOn w:val="VerbatimChar"/>
+    <w:rPr>
+      <w:color w:val="902000"/>
+    </w:rPr>
+  </w:style>
+  <w:style w:customStyle="1" w:styleId="DecValTok" w:type="character">
+    <w:name w:val="DecValTok"/>
+    <w:basedOn w:val="VerbatimChar"/>
+    <w:rPr>
+      <w:color w:val="40a070"/>
+    </w:rPr>
+  </w:style>
+  <w:style w:customStyle="1" w:styleId="BaseNTok" w:type="character">
+    <w:name w:val="BaseNTok"/>
+    <w:basedOn w:val="VerbatimChar"/>
+    <w:rPr>
+      <w:color w:val="40a070"/>
+    </w:rPr>
+  </w:style>
+  <w:style w:customStyle="1" w:styleId="FloatTok" w:type="character">
+    <w:name w:val="FloatTok"/>
+    <w:basedOn w:val="VerbatimChar"/>
+    <w:rPr>
+      <w:color w:val="40a070"/>
+    </w:rPr>
+  </w:style>
+  <w:style w:customStyle="1" w:styleId="ConstantTok" w:type="character">
+    <w:name w:val="ConstantTok"/>
+    <w:basedOn w:val="VerbatimChar"/>
+    <w:rPr>
+      <w:color w:val="880000"/>
+    </w:rPr>
+  </w:style>
+  <w:style w:customStyle="1" w:styleId="CharTok" w:type="character">
+    <w:name w:val="CharTok"/>
+    <w:basedOn w:val="VerbatimChar"/>
+    <w:rPr>
+      <w:color w:val="4070a0"/>
+    </w:rPr>
+  </w:style>
+  <w:style w:customStyle="1" w:styleId="SpecialCharTok" w:type="character">
+    <w:name w:val="SpecialCharTok"/>
+    <w:basedOn w:val="VerbatimChar"/>
+    <w:rPr>
+      <w:color w:val="4070a0"/>
+    </w:rPr>
+  </w:style>
+  <w:style w:customStyle="1" w:styleId="StringTok" w:type="character">
+    <w:name w:val="StringTok"/>
+    <w:basedOn w:val="VerbatimChar"/>
+    <w:rPr>
+      <w:color w:val="4070a0"/>
+    </w:rPr>
+  </w:style>
+  <w:style w:customStyle="1" w:styleId="VerbatimStringTok" w:type="character">
+    <w:name w:val="VerbatimStringTok"/>
+    <w:basedOn w:val="VerbatimChar"/>
+    <w:rPr>
+      <w:color w:val="4070a0"/>
+    </w:rPr>
+  </w:style>
+  <w:style w:customStyle="1" w:styleId="SpecialStringTok" w:type="character">
+    <w:name w:val="SpecialStringTok"/>
+    <w:basedOn w:val="VerbatimChar"/>
+    <w:rPr>
+      <w:color w:val="bb6688"/>
+    </w:rPr>
+  </w:style>
+  <w:style w:customStyle="1" w:styleId="ImportTok" w:type="character">
+    <w:name w:val="ImportTok"/>
+    <w:basedOn w:val="VerbatimChar"/>
+    <w:rPr>
+      <w:b/>
+      <w:color w:val="008000"/>
+    </w:rPr>
+  </w:style>
+  <w:style w:customStyle="1" w:styleId="CommentTok" w:type="character">
+    <w:name w:val="CommentTok"/>
+    <w:basedOn w:val="VerbatimChar"/>
+    <w:rPr>
+      <w:i/>
+      <w:color w:val="60a0b0"/>
+    </w:rPr>
+  </w:style>
+  <w:style w:customStyle="1" w:styleId="DocumentationTok" w:type="character">
+    <w:name w:val="DocumentationTok"/>
+    <w:basedOn w:val="VerbatimChar"/>
+    <w:rPr>
+      <w:i/>
+      <w:color w:val="ba2121"/>
+    </w:rPr>
+  </w:style>
+  <w:style w:customStyle="1" w:styleId="AnnotationTok" w:type="character">
+    <w:name w:val="AnnotationTok"/>
+    <w:basedOn w:val="VerbatimChar"/>
+    <w:rPr>
+      <w:b/>
+      <w:i/>
+      <w:color w:val="60a0b0"/>
+    </w:rPr>
+  </w:style>
+  <w:style w:customStyle="1" w:styleId="CommentVarTok" w:type="character">
+    <w:name w:val="CommentVarTok"/>
+    <w:basedOn w:val="VerbatimChar"/>
+    <w:rPr>
+      <w:b/>
+      <w:i/>
+      <w:color w:val="60a0b0"/>
+    </w:rPr>
+  </w:style>
+  <w:style w:customStyle="1" w:styleId="OtherTok" w:type="character">
+    <w:name w:val="OtherTok"/>
+    <w:basedOn w:val="VerbatimChar"/>
+    <w:rPr>
+      <w:color w:val="007020"/>
+    </w:rPr>
+  </w:style>
+  <w:style w:customStyle="1" w:styleId="FunctionTok" w:type="character">
+    <w:name w:val="FunctionTok"/>
+    <w:basedOn w:val="VerbatimChar"/>
+    <w:rPr>
+      <w:color w:val="06287e"/>
+    </w:rPr>
+  </w:style>
+  <w:style w:customStyle="1" w:styleId="VariableTok" w:type="character">
+    <w:name w:val="VariableTok"/>
+    <w:basedOn w:val="VerbatimChar"/>
+    <w:rPr>
+      <w:color w:val="19177c"/>
+    </w:rPr>
+  </w:style>
+  <w:style w:customStyle="1" w:styleId="ControlFlowTok" w:type="character">
+    <w:name w:val="ControlFlowTok"/>
+    <w:basedOn w:val="VerbatimChar"/>
+    <w:rPr>
+      <w:b/>
+      <w:color w:val="007020"/>
+    </w:rPr>
+  </w:style>
+  <w:style w:customStyle="1" w:styleId="OperatorTok" w:type="character">
+    <w:name w:val="OperatorTok"/>
+    <w:basedOn w:val="VerbatimChar"/>
+    <w:rPr>
+      <w:color w:val="666666"/>
+    </w:rPr>
+  </w:style>
+  <w:style w:customStyle="1" w:styleId="BuiltInTok" w:type="character">
+    <w:name w:val="BuiltInTok"/>
+    <w:basedOn w:val="VerbatimChar"/>
+    <w:rPr>
+      <w:color w:val="008000"/>
+    </w:rPr>
+  </w:style>
+  <w:style w:customStyle="1" w:styleId="ExtensionTok" w:type="character">
+    <w:name w:val="ExtensionTok"/>
+    <w:basedOn w:val="VerbatimChar"/>
+    <w:rPr/>
+  </w:style>
+  <w:style w:customStyle="1" w:styleId="PreprocessorTok" w:type="character">
+    <w:name w:val="PreprocessorTok"/>
+    <w:basedOn w:val="VerbatimChar"/>
+    <w:rPr>
+      <w:color w:val="bc7a00"/>
+    </w:rPr>
+  </w:style>
+  <w:style w:customStyle="1" w:styleId="AttributeTok" w:type="character">
+    <w:name w:val="AttributeTok"/>
+    <w:basedOn w:val="VerbatimChar"/>
+    <w:rPr>
+      <w:color w:val="7d9029"/>
+    </w:rPr>
+  </w:style>
+  <w:style w:customStyle="1" w:styleId="RegionMarkerTok" w:type="character">
+    <w:name w:val="RegionMarkerTok"/>
+    <w:basedOn w:val="VerbatimChar"/>
+    <w:rPr/>
+  </w:style>
+  <w:style w:customStyle="1" w:styleId="InformationTok" w:type="character">
+    <w:name w:val="InformationTok"/>
+    <w:basedOn w:val="VerbatimChar"/>
+    <w:rPr>
+      <w:b/>
+      <w:i/>
+      <w:color w:val="60a0b0"/>
+    </w:rPr>
+  </w:style>
+  <w:style w:customStyle="1" w:styleId="WarningTok" w:type="character">
+    <w:name w:val="WarningTok"/>
+    <w:basedOn w:val="VerbatimChar"/>
+    <w:rPr>
+      <w:b/>
+      <w:i/>
+      <w:color w:val="60a0b0"/>
+    </w:rPr>
+  </w:style>
+  <w:style w:customStyle="1" w:styleId="AlertTok" w:type="character">
+    <w:name w:val="AlertTok"/>
+    <w:basedOn w:val="VerbatimChar"/>
+    <w:rPr>
+      <w:b/>
+      <w:color w:val="ff0000"/>
+    </w:rPr>
+  </w:style>
+  <w:style w:customStyle="1" w:styleId="ErrorTok" w:type="character">
+    <w:name w:val="ErrorTok"/>
+    <w:basedOn w:val="VerbatimChar"/>
+    <w:rPr>
+      <w:b/>
+      <w:color w:val="ff0000"/>
+    </w:rPr>
+  </w:style>
+  <w:style w:customStyle="1" w:styleId="NormalTok" w:type="character">
+    <w:name w:val="NormalTok"/>
+    <w:basedOn w:val="VerbatimChar"/>
+    <w:rPr/>
   </w:style>
   <w:style w:type="character" w:customStyle="1" w:styleId="KeywordTok">
     <w:name w:val="KeywordTok"/>

</xml_diff>